<commit_message>
docs(word): give the tip boxes the same look as in the PDF
The hint boxes only had a background fill, so they hardly stood out. Add
the orange 1pt border on all four sides plus inner padding, matching the
PDF exactly.

Co-Authored-By: Claude Opus 4.8 <noreply@anthropic.com>
</commit_message>
<xml_diff>
--- a/docs/WithEase-Anleitung.docx
+++ b/docs/WithEase-Anleitung.docx
@@ -350,13 +350,25 @@
         <w:tblLook w:firstColumn="1" w:firstRow="1" w:lastColumn="0" w:lastRow="0" w:noHBand="0" w:noVBand="1" w:val="04A0"/>
       </w:tblPr>
       <w:tblGrid>
-        <w:gridCol w:w="9746"/>
+        <w:gridCol w:w="8787"/>
       </w:tblGrid>
       <w:tr>
         <w:tc>
           <w:tcPr>
             <w:tcW w:type="dxa" w:w="8787"/>
-            <w:shd w:val="clear" w:fill="FFF6EA"/>
+            <w:shd w:val="clear" w:color="auto" w:fill="FFF6EA"/>
+            <w:tcBorders>
+              <w:top w:val="single" w:sz="8" w:space="0" w:color="F5901E"/>
+              <w:left w:val="single" w:sz="8" w:space="0" w:color="F5901E"/>
+              <w:bottom w:val="single" w:sz="8" w:space="0" w:color="F5901E"/>
+              <w:right w:val="single" w:sz="8" w:space="0" w:color="F5901E"/>
+            </w:tcBorders>
+            <w:tcMar>
+              <w:top w:w="140" w:type="dxa"/>
+              <w:start w:w="140" w:type="dxa"/>
+              <w:bottom w:w="140" w:type="dxa"/>
+              <w:end w:w="140" w:type="dxa"/>
+            </w:tcMar>
           </w:tcPr>
           <w:p>
             <w:r>
@@ -507,13 +519,25 @@
         <w:tblLook w:firstColumn="1" w:firstRow="1" w:lastColumn="0" w:lastRow="0" w:noHBand="0" w:noVBand="1" w:val="04A0"/>
       </w:tblPr>
       <w:tblGrid>
-        <w:gridCol w:w="9746"/>
+        <w:gridCol w:w="8787"/>
       </w:tblGrid>
       <w:tr>
         <w:tc>
           <w:tcPr>
             <w:tcW w:type="dxa" w:w="8787"/>
-            <w:shd w:val="clear" w:fill="FFF6EA"/>
+            <w:shd w:val="clear" w:color="auto" w:fill="FFF6EA"/>
+            <w:tcBorders>
+              <w:top w:val="single" w:sz="8" w:space="0" w:color="F5901E"/>
+              <w:left w:val="single" w:sz="8" w:space="0" w:color="F5901E"/>
+              <w:bottom w:val="single" w:sz="8" w:space="0" w:color="F5901E"/>
+              <w:right w:val="single" w:sz="8" w:space="0" w:color="F5901E"/>
+            </w:tcBorders>
+            <w:tcMar>
+              <w:top w:w="140" w:type="dxa"/>
+              <w:start w:w="140" w:type="dxa"/>
+              <w:bottom w:w="140" w:type="dxa"/>
+              <w:end w:w="140" w:type="dxa"/>
+            </w:tcMar>
           </w:tcPr>
           <w:p>
             <w:r>
@@ -821,13 +845,25 @@
         <w:tblLook w:firstColumn="1" w:firstRow="1" w:lastColumn="0" w:lastRow="0" w:noHBand="0" w:noVBand="1" w:val="04A0"/>
       </w:tblPr>
       <w:tblGrid>
-        <w:gridCol w:w="9746"/>
+        <w:gridCol w:w="8787"/>
       </w:tblGrid>
       <w:tr>
         <w:tc>
           <w:tcPr>
             <w:tcW w:type="dxa" w:w="8787"/>
-            <w:shd w:val="clear" w:fill="FFF6EA"/>
+            <w:shd w:val="clear" w:color="auto" w:fill="FFF6EA"/>
+            <w:tcBorders>
+              <w:top w:val="single" w:sz="8" w:space="0" w:color="F5901E"/>
+              <w:left w:val="single" w:sz="8" w:space="0" w:color="F5901E"/>
+              <w:bottom w:val="single" w:sz="8" w:space="0" w:color="F5901E"/>
+              <w:right w:val="single" w:sz="8" w:space="0" w:color="F5901E"/>
+            </w:tcBorders>
+            <w:tcMar>
+              <w:top w:w="140" w:type="dxa"/>
+              <w:start w:w="140" w:type="dxa"/>
+              <w:bottom w:w="140" w:type="dxa"/>
+              <w:end w:w="140" w:type="dxa"/>
+            </w:tcMar>
           </w:tcPr>
           <w:p>
             <w:r>
@@ -979,13 +1015,25 @@
         <w:tblLook w:firstColumn="1" w:firstRow="1" w:lastColumn="0" w:lastRow="0" w:noHBand="0" w:noVBand="1" w:val="04A0"/>
       </w:tblPr>
       <w:tblGrid>
-        <w:gridCol w:w="9746"/>
+        <w:gridCol w:w="8787"/>
       </w:tblGrid>
       <w:tr>
         <w:tc>
           <w:tcPr>
             <w:tcW w:type="dxa" w:w="8787"/>
-            <w:shd w:val="clear" w:fill="FFF6EA"/>
+            <w:shd w:val="clear" w:color="auto" w:fill="FFF6EA"/>
+            <w:tcBorders>
+              <w:top w:val="single" w:sz="8" w:space="0" w:color="F5901E"/>
+              <w:left w:val="single" w:sz="8" w:space="0" w:color="F5901E"/>
+              <w:bottom w:val="single" w:sz="8" w:space="0" w:color="F5901E"/>
+              <w:right w:val="single" w:sz="8" w:space="0" w:color="F5901E"/>
+            </w:tcBorders>
+            <w:tcMar>
+              <w:top w:w="140" w:type="dxa"/>
+              <w:start w:w="140" w:type="dxa"/>
+              <w:bottom w:w="140" w:type="dxa"/>
+              <w:end w:w="140" w:type="dxa"/>
+            </w:tcMar>
           </w:tcPr>
           <w:p>
             <w:r>
@@ -1729,13 +1777,25 @@
         <w:tblLook w:firstColumn="1" w:firstRow="1" w:lastColumn="0" w:lastRow="0" w:noHBand="0" w:noVBand="1" w:val="04A0"/>
       </w:tblPr>
       <w:tblGrid>
-        <w:gridCol w:w="9746"/>
+        <w:gridCol w:w="8787"/>
       </w:tblGrid>
       <w:tr>
         <w:tc>
           <w:tcPr>
             <w:tcW w:type="dxa" w:w="8787"/>
-            <w:shd w:val="clear" w:fill="FFF6EA"/>
+            <w:shd w:val="clear" w:color="auto" w:fill="FFF6EA"/>
+            <w:tcBorders>
+              <w:top w:val="single" w:sz="8" w:space="0" w:color="F5901E"/>
+              <w:left w:val="single" w:sz="8" w:space="0" w:color="F5901E"/>
+              <w:bottom w:val="single" w:sz="8" w:space="0" w:color="F5901E"/>
+              <w:right w:val="single" w:sz="8" w:space="0" w:color="F5901E"/>
+            </w:tcBorders>
+            <w:tcMar>
+              <w:top w:w="140" w:type="dxa"/>
+              <w:start w:w="140" w:type="dxa"/>
+              <w:bottom w:w="140" w:type="dxa"/>
+              <w:end w:w="140" w:type="dxa"/>
+            </w:tcMar>
           </w:tcPr>
           <w:p>
             <w:r>
@@ -2066,13 +2126,25 @@
         <w:tblLook w:firstColumn="1" w:firstRow="1" w:lastColumn="0" w:lastRow="0" w:noHBand="0" w:noVBand="1" w:val="04A0"/>
       </w:tblPr>
       <w:tblGrid>
-        <w:gridCol w:w="9746"/>
+        <w:gridCol w:w="8787"/>
       </w:tblGrid>
       <w:tr>
         <w:tc>
           <w:tcPr>
             <w:tcW w:type="dxa" w:w="8787"/>
-            <w:shd w:val="clear" w:fill="FFF6EA"/>
+            <w:shd w:val="clear" w:color="auto" w:fill="FFF6EA"/>
+            <w:tcBorders>
+              <w:top w:val="single" w:sz="8" w:space="0" w:color="F5901E"/>
+              <w:left w:val="single" w:sz="8" w:space="0" w:color="F5901E"/>
+              <w:bottom w:val="single" w:sz="8" w:space="0" w:color="F5901E"/>
+              <w:right w:val="single" w:sz="8" w:space="0" w:color="F5901E"/>
+            </w:tcBorders>
+            <w:tcMar>
+              <w:top w:w="140" w:type="dxa"/>
+              <w:start w:w="140" w:type="dxa"/>
+              <w:bottom w:w="140" w:type="dxa"/>
+              <w:end w:w="140" w:type="dxa"/>
+            </w:tcMar>
           </w:tcPr>
           <w:p>
             <w:r>
@@ -2535,13 +2607,25 @@
         <w:tblLook w:firstColumn="1" w:firstRow="1" w:lastColumn="0" w:lastRow="0" w:noHBand="0" w:noVBand="1" w:val="04A0"/>
       </w:tblPr>
       <w:tblGrid>
-        <w:gridCol w:w="9746"/>
+        <w:gridCol w:w="8787"/>
       </w:tblGrid>
       <w:tr>
         <w:tc>
           <w:tcPr>
             <w:tcW w:type="dxa" w:w="8787"/>
-            <w:shd w:val="clear" w:fill="FFF6EA"/>
+            <w:shd w:val="clear" w:color="auto" w:fill="FFF6EA"/>
+            <w:tcBorders>
+              <w:top w:val="single" w:sz="8" w:space="0" w:color="F5901E"/>
+              <w:left w:val="single" w:sz="8" w:space="0" w:color="F5901E"/>
+              <w:bottom w:val="single" w:sz="8" w:space="0" w:color="F5901E"/>
+              <w:right w:val="single" w:sz="8" w:space="0" w:color="F5901E"/>
+            </w:tcBorders>
+            <w:tcMar>
+              <w:top w:w="140" w:type="dxa"/>
+              <w:start w:w="140" w:type="dxa"/>
+              <w:bottom w:w="140" w:type="dxa"/>
+              <w:end w:w="140" w:type="dxa"/>
+            </w:tcMar>
           </w:tcPr>
           <w:p>
             <w:r>
@@ -2929,13 +3013,25 @@
         <w:tblLook w:firstColumn="1" w:firstRow="1" w:lastColumn="0" w:lastRow="0" w:noHBand="0" w:noVBand="1" w:val="04A0"/>
       </w:tblPr>
       <w:tblGrid>
-        <w:gridCol w:w="9746"/>
+        <w:gridCol w:w="8787"/>
       </w:tblGrid>
       <w:tr>
         <w:tc>
           <w:tcPr>
             <w:tcW w:type="dxa" w:w="8787"/>
-            <w:shd w:val="clear" w:fill="FFF6EA"/>
+            <w:shd w:val="clear" w:color="auto" w:fill="FFF6EA"/>
+            <w:tcBorders>
+              <w:top w:val="single" w:sz="8" w:space="0" w:color="F5901E"/>
+              <w:left w:val="single" w:sz="8" w:space="0" w:color="F5901E"/>
+              <w:bottom w:val="single" w:sz="8" w:space="0" w:color="F5901E"/>
+              <w:right w:val="single" w:sz="8" w:space="0" w:color="F5901E"/>
+            </w:tcBorders>
+            <w:tcMar>
+              <w:top w:w="140" w:type="dxa"/>
+              <w:start w:w="140" w:type="dxa"/>
+              <w:bottom w:w="140" w:type="dxa"/>
+              <w:end w:w="140" w:type="dxa"/>
+            </w:tcMar>
           </w:tcPr>
           <w:p>
             <w:r>

</xml_diff>

<commit_message>
docs(manual): add disclaimer, neutralise the sample name, fix Word lists
- New "Disclaimer" section up front (both PDF and Word): the author is not
  a trained developer and the app was built with AI assistance ("vibe
  coding") – stated openly, as the author wants.
- Macro screenshot now uses "Max Mustermann" instead of the author's real
  name, and proper umlauts in the sample text.
- Word: numbered lists restart at 1 (they continued 5,6,7 because the
  built-in List Number style shares one counter) and hint boxes no longer
  break across pages.
- Drop the now-redundant "Offen gesagt" box at the end.

Co-Authored-By: Claude Opus 4.8 <noreply@anthropic.com>
</commit_message>
<xml_diff>
--- a/docs/WithEase-Anleitung.docx
+++ b/docs/WithEase-Anleitung.docx
@@ -129,72 +129,126 @@
     </w:p>
     <w:p>
       <w:r>
-        <w:t>1.  Was ist WithEase?</w:t>
+        <w:t>Disclaimer</w:t>
       </w:r>
     </w:p>
     <w:p>
       <w:r>
-        <w:t>2.  Installation</w:t>
+        <w:t>1.  Was ist WithEase?</w:t>
       </w:r>
     </w:p>
     <w:p>
       <w:r>
-        <w:t>3.  Erste Schritte</w:t>
+        <w:t>2.  Installation</w:t>
       </w:r>
     </w:p>
     <w:p>
       <w:r>
-        <w:t>4.  Allgemeine Einstellungen</w:t>
+        <w:t>3.  Erste Schritte</w:t>
       </w:r>
     </w:p>
     <w:p>
       <w:r>
-        <w:t>5.  Der Notfall-Stop</w:t>
+        <w:t>4.  Allgemeine Einstellungen</w:t>
       </w:r>
     </w:p>
     <w:p>
       <w:r>
-        <w:t>6.  Maus-Modul</w:t>
+        <w:t>5.  Der Notfall-Stop</w:t>
       </w:r>
     </w:p>
     <w:p>
       <w:r>
-        <w:t>7.  Tastatur-Modul</w:t>
+        <w:t>6.  Maus-Modul</w:t>
       </w:r>
     </w:p>
     <w:p>
       <w:r>
-        <w:t>8.  Makros</w:t>
+        <w:t>7.  Tastatur-Modul</w:t>
       </w:r>
     </w:p>
     <w:p>
       <w:r>
-        <w:t>9.  Profile</w:t>
+        <w:t>8.  Makros</w:t>
       </w:r>
     </w:p>
     <w:p>
       <w:r>
-        <w:t>10.  Aktionen &amp; Favoriten-Overlay</w:t>
+        <w:t>9.  Profile</w:t>
       </w:r>
     </w:p>
     <w:p>
       <w:r>
-        <w:t>11.  Modul-Bibliothek</w:t>
+        <w:t>10.  Aktionen &amp; Favoriten-Overlay</w:t>
       </w:r>
     </w:p>
     <w:p>
       <w:r>
-        <w:t>12.  Über, Feedback &amp; Teilen</w:t>
+        <w:t>11.  Modul-Bibliothek</w:t>
       </w:r>
     </w:p>
     <w:p>
       <w:r>
-        <w:t>13.  Tipps &amp; Problemlösung</w:t>
+        <w:t>12.  Über, Feedback &amp; Teilen</w:t>
       </w:r>
     </w:p>
     <w:p>
       <w:r>
+        <w:t>13.  Tipps &amp; Problemlösung</w:t>
+      </w:r>
+    </w:p>
+    <w:p>
+      <w:r>
         <w:t>14.  Hilfe &amp; Kontakt</w:t>
+      </w:r>
+    </w:p>
+    <w:p>
+      <w:r>
+        <w:br w:type="page"/>
+      </w:r>
+    </w:p>
+    <w:p>
+      <w:pPr>
+        <w:pStyle w:val="Heading1"/>
+      </w:pPr>
+      <w:r>
+        <w:t>Disclaimer</w:t>
+      </w:r>
+    </w:p>
+    <w:p>
+      <w:r>
+        <w:rPr>
+          <w:b w:val="0"/>
+        </w:rPr>
+        <w:t>Ein offenes Wort vorweg: Ich bin kein ausgebildeter Software-Entwickler, sondern jemand mit Interesse am Programmieren – und mit Ideen, von denen ich überzeugt bin, dass sie anderen helfen können.</w:t>
+      </w:r>
+    </w:p>
+    <w:p>
+      <w:r>
+        <w:rPr>
+          <w:b w:val="0"/>
+        </w:rPr>
+        <w:t xml:space="preserve">WithEase ist mit </w:t>
+      </w:r>
+      <w:r>
+        <w:rPr>
+          <w:b/>
+        </w:rPr>
+        <w:t>„Vibe-Coding“</w:t>
+      </w:r>
+      <w:r>
+        <w:rPr>
+          <w:b w:val="0"/>
+        </w:rPr>
+        <w:t xml:space="preserve"> entstanden, also mit Unterstützung durch künstliche Intelligenz. Dazu stehe ich offen. Aus meiner Sicht ist das kein Grund, sich zu schämen, sondern heute durchaus normal. Ohne diese Möglichkeit wären die Gedanken in meinem Kopf nie Wirklichkeit geworden – jedenfalls nicht in einem Umfang, der es mir erlaubt, das Programm nun kostenlos zur Verfügung zu stellen.</w:t>
+      </w:r>
+    </w:p>
+    <w:p>
+      <w:r>
+        <w:rPr>
+          <w:b w:val="0"/>
+        </w:rPr>
+        <w:t>Genau deshalb ist mir Ihre Rückmeldung wichtig: Sie hilft, WithEase Schritt für Schritt besser zu machen.</w:t>
       </w:r>
     </w:p>
     <w:p>
@@ -353,6 +407,9 @@
         <w:gridCol w:w="8787"/>
       </w:tblGrid>
       <w:tr>
+        <w:trPr>
+          <w:cantSplit/>
+        </w:trPr>
         <w:tc>
           <w:tcPr>
             <w:tcW w:type="dxa" w:w="8787"/>
@@ -417,6 +474,10 @@
     <w:p>
       <w:pPr>
         <w:pStyle w:val="ListNumber"/>
+        <w:numPr>
+          <w:ilvl w:val="0"/>
+          <w:numId w:val="10"/>
+        </w:numPr>
       </w:pPr>
       <w:r>
         <w:rPr>
@@ -440,6 +501,10 @@
     <w:p>
       <w:pPr>
         <w:pStyle w:val="ListNumber"/>
+        <w:numPr>
+          <w:ilvl w:val="0"/>
+          <w:numId w:val="10"/>
+        </w:numPr>
       </w:pPr>
       <w:r>
         <w:rPr>
@@ -463,6 +528,10 @@
     <w:p>
       <w:pPr>
         <w:pStyle w:val="ListNumber"/>
+        <w:numPr>
+          <w:ilvl w:val="0"/>
+          <w:numId w:val="10"/>
+        </w:numPr>
       </w:pPr>
       <w:r>
         <w:rPr>
@@ -480,6 +549,10 @@
     <w:p>
       <w:pPr>
         <w:pStyle w:val="ListNumber"/>
+        <w:numPr>
+          <w:ilvl w:val="0"/>
+          <w:numId w:val="10"/>
+        </w:numPr>
       </w:pPr>
       <w:r>
         <w:rPr>
@@ -522,6 +595,9 @@
         <w:gridCol w:w="8787"/>
       </w:tblGrid>
       <w:tr>
+        <w:trPr>
+          <w:cantSplit/>
+        </w:trPr>
         <w:tc>
           <w:tcPr>
             <w:tcW w:type="dxa" w:w="8787"/>
@@ -848,6 +924,9 @@
         <w:gridCol w:w="8787"/>
       </w:tblGrid>
       <w:tr>
+        <w:trPr>
+          <w:cantSplit/>
+        </w:trPr>
         <w:tc>
           <w:tcPr>
             <w:tcW w:type="dxa" w:w="8787"/>
@@ -1018,6 +1097,9 @@
         <w:gridCol w:w="8787"/>
       </w:tblGrid>
       <w:tr>
+        <w:trPr>
+          <w:cantSplit/>
+        </w:trPr>
         <w:tc>
           <w:tcPr>
             <w:tcW w:type="dxa" w:w="8787"/>
@@ -1780,6 +1862,9 @@
         <w:gridCol w:w="8787"/>
       </w:tblGrid>
       <w:tr>
+        <w:trPr>
+          <w:cantSplit/>
+        </w:trPr>
         <w:tc>
           <w:tcPr>
             <w:tcW w:type="dxa" w:w="8787"/>
@@ -1873,6 +1958,10 @@
     <w:p>
       <w:pPr>
         <w:pStyle w:val="ListNumber"/>
+        <w:numPr>
+          <w:ilvl w:val="0"/>
+          <w:numId w:val="11"/>
+        </w:numPr>
       </w:pPr>
       <w:r>
         <w:rPr>
@@ -1896,6 +1985,10 @@
     <w:p>
       <w:pPr>
         <w:pStyle w:val="ListNumber"/>
+        <w:numPr>
+          <w:ilvl w:val="0"/>
+          <w:numId w:val="11"/>
+        </w:numPr>
       </w:pPr>
       <w:r>
         <w:rPr>
@@ -1919,6 +2012,10 @@
     <w:p>
       <w:pPr>
         <w:pStyle w:val="ListNumber"/>
+        <w:numPr>
+          <w:ilvl w:val="0"/>
+          <w:numId w:val="11"/>
+        </w:numPr>
       </w:pPr>
       <w:r>
         <w:rPr>
@@ -2129,6 +2226,9 @@
         <w:gridCol w:w="8787"/>
       </w:tblGrid>
       <w:tr>
+        <w:trPr>
+          <w:cantSplit/>
+        </w:trPr>
         <w:tc>
           <w:tcPr>
             <w:tcW w:type="dxa" w:w="8787"/>
@@ -2610,6 +2710,9 @@
         <w:gridCol w:w="8787"/>
       </w:tblGrid>
       <w:tr>
+        <w:trPr>
+          <w:cantSplit/>
+        </w:trPr>
         <w:tc>
           <w:tcPr>
             <w:tcW w:type="dxa" w:w="8787"/>
@@ -3016,6 +3119,9 @@
         <w:gridCol w:w="8787"/>
       </w:tblGrid>
       <w:tr>
+        <w:trPr>
+          <w:cantSplit/>
+        </w:trPr>
         <w:tc>
           <w:tcPr>
             <w:tcW w:type="dxa" w:w="8787"/>
@@ -3038,7 +3144,7 @@
               <w:rPr>
                 <w:b/>
               </w:rPr>
-              <w:t>Offen gesagt</w:t>
+              <w:t>Jede Rückmeldung hilft</w:t>
             </w:r>
           </w:p>
           <w:p>
@@ -3046,7 +3152,7 @@
               <w:rPr>
                 <w:b w:val="0"/>
               </w:rPr>
-              <w:t>WithEase ist mit KI-Unterstützung („Vibe-Coding“) entstanden. Erst dadurch konnte aus einer Idee ein nutzbares Programm werden, das ich anderen zur Verfügung stellen kann. Genau deshalb ist Ihr Feedback so wertvoll.</w:t>
+              <w:t>Egal ob Fehler, Wunsch oder eine Idee, die Ihnen den Alltag erleichtern würde – schreiben Sie mir gern. WithEase lebt davon, dass Betroffene sagen, was sie wirklich brauchen.</w:t>
             </w:r>
           </w:p>
         </w:tc>
@@ -3084,6 +3190,28 @@
 
 <file path=word/numbering.xml><?xml version="1.0" encoding="utf-8"?>
 <w:numbering xmlns:wpc="http://schemas.microsoft.com/office/word/2010/wordprocessingCanvas" xmlns:mo="http://schemas.microsoft.com/office/mac/office/2008/main" xmlns:mc="http://schemas.openxmlformats.org/markup-compatibility/2006" xmlns:mv="urn:schemas-microsoft-com:mac:vml" xmlns:o="urn:schemas-microsoft-com:office:office" xmlns:r="http://schemas.openxmlformats.org/officeDocument/2006/relationships" xmlns:m="http://schemas.openxmlformats.org/officeDocument/2006/math" xmlns:v="urn:schemas-microsoft-com:vml" xmlns:wp14="http://schemas.microsoft.com/office/word/2010/wordprocessingDrawing" xmlns:wp="http://schemas.openxmlformats.org/drawingml/2006/wordprocessingDrawing" xmlns:w10="urn:schemas-microsoft-com:office:word" xmlns:w="http://schemas.openxmlformats.org/wordprocessingml/2006/main" xmlns:w14="http://schemas.microsoft.com/office/word/2010/wordml" xmlns:wpg="http://schemas.microsoft.com/office/word/2010/wordprocessingGroup" xmlns:wpi="http://schemas.microsoft.com/office/word/2010/wordprocessingInk" xmlns:wne="http://schemas.microsoft.com/office/word/2006/wordml" xmlns:wps="http://schemas.microsoft.com/office/word/2010/wordprocessingShape" mc:Ignorable="w14 wp14">
+  <w:abstractNum w:abstractNumId="10">
+    <w:lvl w:ilvl="0">
+      <w:start w:val="1"/>
+      <w:numFmt w:val="decimal"/>
+      <w:lvlText w:val="%1."/>
+      <w:lvlJc w:val="left"/>
+      <w:pPr>
+        <w:ind w:left="720" w:hanging="360"/>
+      </w:pPr>
+    </w:lvl>
+  </w:abstractNum>
+  <w:abstractNum w:abstractNumId="9">
+    <w:lvl w:ilvl="0">
+      <w:start w:val="1"/>
+      <w:numFmt w:val="decimal"/>
+      <w:lvlText w:val="%1."/>
+      <w:lvlJc w:val="left"/>
+      <w:pPr>
+        <w:ind w:left="720" w:hanging="360"/>
+      </w:pPr>
+    </w:lvl>
+  </w:abstractNum>
   <w:abstractNum w:abstractNumId="0">
     <w:nsid w:val="FFFFFF7C"/>
     <w:multiLevelType w:val="singleLevel"/>
@@ -3281,6 +3409,12 @@
   </w:num>
   <w:num w:numId="9">
     <w:abstractNumId w:val="0"/>
+  </w:num>
+  <w:num w:numId="10">
+    <w:abstractNumId w:val="9"/>
+  </w:num>
+  <w:num w:numId="11">
+    <w:abstractNumId w:val="10"/>
   </w:num>
 </w:numbering>
 </file>

</xml_diff>

<commit_message>
feat(dictation): tidy settings into groups, casing fix, KI preview, font fixes
- Settings page reorganized into 4 titled groups + a collapsible "Advanced"
  section; removed training-data/voice-enrollment UI and dead live-mode
  rows plus the stale live-dictation hint
- postprocess.fix_casing(): undo Whisper's stray mid-sentence capitalisation
  (conservative, function words only; nouns/formal "Sie"/acronyms untouched)
- KI-action preview dialog with word-level change highlighting (accept/discard)
- Escape cancels the multi-match selection; history load is data-loss-safe
- Fix the "Ziel-App wählen" button font not following the global font size
  (a QSS font-weight baked the size and broke app-font inheritance)
- Manual: dictation chapter updated for the new settings groups + KI features

Co-Authored-By: Claude Opus 4.8 <noreply@anthropic.com>
</commit_message>
<xml_diff>
--- a/docs/WithEase-Anleitung.docx
+++ b/docs/WithEase-Anleitung.docx
@@ -189,17 +189,22 @@
     </w:p>
     <w:p>
       <w:r>
-        <w:t>12.  Über, Feedback &amp; Teilen</w:t>
+        <w:t xml:space="preserve">12.  Diktieren</w:t>
       </w:r>
     </w:p>
     <w:p>
       <w:r>
-        <w:t>13.  Tipps &amp; Problemlösung</w:t>
+        <w:t xml:space="preserve">13.  Über, Feedback &amp; Teilen</w:t>
       </w:r>
     </w:p>
     <w:p>
       <w:r>
-        <w:t>14.  Hilfe &amp; Kontakt</w:t>
+        <w:t xml:space="preserve">14.  Tipps &amp; Problemlösung</w:t>
+      </w:r>
+    </w:p>
+    <w:p>
+      <w:r>
+        <w:t xml:space="preserve">15.  Hilfe &amp; Kontakt</w:t>
       </w:r>
     </w:p>
     <w:p>
@@ -2760,7 +2765,692 @@
         <w:pStyle w:val="Heading1"/>
       </w:pPr>
       <w:r>
-        <w:t>12. Über, Feedback &amp; Teilen</w:t>
+        <w:t xml:space="preserve">12. Diktieren</w:t>
+      </w:r>
+    </w:p>
+    <w:p>
+      <w:r>
+        <w:rPr>
+          <w:b w:val="0"/>
+        </w:rPr>
+        <w:t xml:space="preserve">Das Diktier-Modul wandelt gesprochene Sprache in Text um und fügt ihn in die zuvor gewählte Anwendung ein. Sie aktivieren es in der Modul-Bibliothek. Datenschutz: Beim Cloud-Backend wird die Aufnahme an den gewählten Anbieter gesendet; beim lokalen Backend bleibt alles auf diesem PC.</w:t>
+      </w:r>
+      <w:r>
+        <w:rPr>
+          <w:b/>
+        </w:rPr>
+        <w:t/>
+      </w:r>
+      <w:r>
+        <w:rPr>
+          <w:b w:val="0"/>
+        </w:rPr>
+        <w:t xml:space="preserve"/>
+      </w:r>
+    </w:p>
+    <w:p>
+      <w:pPr>
+        <w:pStyle w:val="Heading2"/>
+      </w:pPr>
+      <w:r>
+        <w:t>Die Einstellungen im Überblick</w:t>
+      </w:r>
+    </w:p>
+    <w:p>
+      <w:pPr/>
+      <w:r>
+        <w:t>Die Einstellungen des Diktier-Moduls sind in klare Bereiche gegliedert, damit Sie schnell finden, was Sie brauchen:</w:t>
+      </w:r>
+    </w:p>
+    <w:p>
+      <w:pPr>
+        <w:pStyle w:val="ListBullet"/>
+      </w:pPr>
+      <w:r>
+        <w:t>Grundeinstellungen: Diktier-Taste, Aufnahmemodus (Umschalten oder Halten) und Sprache.</w:t>
+      </w:r>
+    </w:p>
+    <w:p>
+      <w:pPr>
+        <w:pStyle w:val="ListBullet"/>
+      </w:pPr>
+      <w:r>
+        <w:t>Spracherkennung: Umschalten zwischen Cloud und Lokal – es werden jeweils nur die dazu passenden Felder angezeigt. Hier liegt auch die Schaltfläche zum Testen.</w:t>
+      </w:r>
+    </w:p>
+    <w:p>
+      <w:pPr>
+        <w:pStyle w:val="ListBullet"/>
+      </w:pPr>
+      <w:r>
+        <w:t>Textausgabe: ob der Text zuerst im Diktierfenster erscheint oder direkt eingefügt wird, sowie die Einfüge-Methode (Zwischenablage oder Tippen).</w:t>
+      </w:r>
+    </w:p>
+    <w:p>
+      <w:pPr>
+        <w:pStyle w:val="ListBullet"/>
+      </w:pPr>
+      <w:r>
+        <w:t>Wörterbuch &amp; KI: Ihr persönliches Wörterbuch sowie die optionalen KI-Funktionen.</w:t>
+      </w:r>
+    </w:p>
+    <w:p>
+      <w:pPr>
+        <w:pStyle w:val="ListBullet"/>
+      </w:pPr>
+      <w:r>
+        <w:t>Erweitert (standardmäßig eingeklappt): selten benötigte Optionen wie eine eigene Befehlstaste, die Mikrofon-Auswahl, die maximale Aufnahmedauer und die Diagnose-Option „Nur reine Erkennung“.</w:t>
+      </w:r>
+    </w:p>
+    <w:p>
+      <w:pPr>
+        <w:pStyle w:val="Heading2"/>
+      </w:pPr>
+      <w:r>
+        <w:t xml:space="preserve">Die zwei Betriebsarten</w:t>
+      </w:r>
+    </w:p>
+    <w:p>
+      <w:pPr>
+        <w:pStyle w:val="ListBullet"/>
+      </w:pPr>
+      <w:r>
+        <w:rPr>
+          <w:b/>
+        </w:rPr>
+        <w:t xml:space="preserve">Cloud: schnell und ohne eigenes Modell, benötigt aber Internet und einen Zugangsschlüssel. Die Aufnahme wird an den Anbieter geschickt.</w:t>
+      </w:r>
+      <w:r>
+        <w:rPr>
+          <w:b w:val="0"/>
+        </w:rPr>
+        <w:t xml:space="preserve"/>
+      </w:r>
+    </w:p>
+    <w:p>
+      <w:pPr>
+        <w:pStyle w:val="ListBullet"/>
+      </w:pPr>
+      <w:r>
+        <w:rPr>
+          <w:b/>
+        </w:rPr>
+        <w:t xml:space="preserve">Lokal (Whisper): läuft vollständig offline auf diesem PC und ist sehr genau. Das Modell wird einmalig geladen.</w:t>
+      </w:r>
+      <w:r>
+        <w:rPr>
+          <w:b w:val="0"/>
+        </w:rPr>
+        <w:t xml:space="preserve"/>
+      </w:r>
+    </w:p>
+    <w:p>
+      <w:pPr>
+        <w:pStyle w:val="Heading2"/>
+      </w:pPr>
+      <w:r>
+        <w:t xml:space="preserve">So diktieren Sie</w:t>
+      </w:r>
+    </w:p>
+    <w:p>
+      <w:pPr>
+        <w:pStyle w:val="ListBullet"/>
+      </w:pPr>
+      <w:r>
+        <w:rPr>
+          <w:b/>
+        </w:rPr>
+        <w:t xml:space="preserve">Diktier-Taste (Hotkey) drücken, sprechen und die Taste erneut drücken. Der erkannte Text erscheint im Diktierfenster.</w:t>
+      </w:r>
+      <w:r>
+        <w:rPr>
+          <w:b w:val="0"/>
+        </w:rPr>
+        <w:t xml:space="preserve"/>
+      </w:r>
+    </w:p>
+    <w:p>
+      <w:pPr>
+        <w:pStyle w:val="ListBullet"/>
+      </w:pPr>
+      <w:r>
+        <w:rPr>
+          <w:b/>
+        </w:rPr>
+        <w:t xml:space="preserve">Ziel-App wählen: Klicken Sie auf „Ziel-App wählen“ und dann in die Anwendung, in die der Text eingefügt werden soll. WithEase merkt sich diese App; das Diktierfenster kommt anschließend automatisch wieder in den Vordergrund, weil dort Ihr nächster Schritt ist.</w:t>
+      </w:r>
+      <w:r>
+        <w:rPr>
+          <w:b w:val="0"/>
+        </w:rPr>
+        <w:t xml:space="preserve"/>
+      </w:r>
+    </w:p>
+    <w:p>
+      <w:pPr>
+        <w:pStyle w:val="ListBullet"/>
+      </w:pPr>
+      <w:r>
+        <w:rPr>
+          <w:b/>
+        </w:rPr>
+        <w:t xml:space="preserve">„Einfügen“ überträgt den Text in die gemerkte Ziel-App, „Kopieren“ legt ihn in die Zwischenablage.</w:t>
+      </w:r>
+      <w:r>
+        <w:rPr>
+          <w:b w:val="0"/>
+        </w:rPr>
+        <w:t xml:space="preserve"/>
+      </w:r>
+    </w:p>
+    <w:p>
+      <w:pPr>
+        <w:pStyle w:val="Heading2"/>
+      </w:pPr>
+      <w:r>
+        <w:t xml:space="preserve">Lokale Erkennung</w:t>
+      </w:r>
+    </w:p>
+    <w:p>
+      <w:pPr>
+        <w:pStyle w:val="ListBullet"/>
+      </w:pPr>
+      <w:r>
+        <w:rPr>
+          <w:b/>
+        </w:rPr>
+        <w:t xml:space="preserve">Whisper-Modell: „small“ ist schnell, „medium“ deutlich genauer (empfohlen). „large-v3“ nur mit einer starken Grafikkarte.</w:t>
+      </w:r>
+      <w:r>
+        <w:rPr>
+          <w:b w:val="0"/>
+        </w:rPr>
+        <w:t xml:space="preserve"/>
+      </w:r>
+    </w:p>
+    <w:p>
+      <w:r>
+        <w:rPr>
+          <w:b w:val="0"/>
+        </w:rPr>
+        <w:t xml:space="preserve">Tipp: Ein gutes, nah am Mund platziertes Mikrofon (Headset) verbessert die Erkennung mit Abstand am meisten.</w:t>
+      </w:r>
+      <w:r>
+        <w:rPr>
+          <w:b/>
+        </w:rPr>
+        <w:t/>
+      </w:r>
+      <w:r>
+        <w:rPr>
+          <w:b w:val="0"/>
+        </w:rPr>
+        <w:t xml:space="preserve"/>
+      </w:r>
+    </w:p>
+    <w:p>
+      <w:pPr>
+        <w:pStyle w:val="Heading2"/>
+      </w:pPr>
+      <w:r>
+        <w:t xml:space="preserve">Sprachbefehle</w:t>
+      </w:r>
+    </w:p>
+    <w:p>
+      <w:r>
+        <w:rPr>
+          <w:b w:val="0"/>
+        </w:rPr>
+        <w:t xml:space="preserve">Während des Diktats navigieren und formatieren Sie mit gesprochenen Befehlen. Tipp: Legen Sie eine zweite „Befehlstaste“ fest – dann gilt die Diktier-Taste immer als Text und die Befehlstaste immer als Befehl.</w:t>
+      </w:r>
+      <w:r>
+        <w:rPr>
+          <w:b/>
+        </w:rPr>
+        <w:t/>
+      </w:r>
+      <w:r>
+        <w:rPr>
+          <w:b w:val="0"/>
+        </w:rPr>
+        <w:t xml:space="preserve"/>
+      </w:r>
+    </w:p>
+    <w:p>
+      <w:pPr>
+        <w:pStyle w:val="ListBullet"/>
+      </w:pPr>
+      <w:r>
+        <w:rPr>
+          <w:b/>
+        </w:rPr>
+        <w:t xml:space="preserve">Cursor setzen: „Cursor vor [Wort]“, „hinter [Wort]“, „an den Anfang“, „ans Ende“.</w:t>
+      </w:r>
+      <w:r>
+        <w:rPr>
+          <w:b w:val="0"/>
+        </w:rPr>
+        <w:t xml:space="preserve"/>
+      </w:r>
+    </w:p>
+    <w:p>
+      <w:pPr>
+        <w:pStyle w:val="ListBullet"/>
+      </w:pPr>
+      <w:r>
+        <w:rPr>
+          <w:b/>
+        </w:rPr>
+        <w:t xml:space="preserve">Markieren: „markiere [Wort]“, „markiere alles“, „markiere von … bis …“, „markiere den letzten Satz“.</w:t>
+      </w:r>
+      <w:r>
+        <w:rPr>
+          <w:b w:val="0"/>
+        </w:rPr>
+        <w:t xml:space="preserve"/>
+      </w:r>
+    </w:p>
+    <w:p>
+      <w:pPr>
+        <w:pStyle w:val="ListBullet"/>
+      </w:pPr>
+      <w:r>
+        <w:rPr>
+          <w:b/>
+        </w:rPr>
+        <w:t xml:space="preserve">Löschen: „lösche [Wort]“, „lösche das“, „lösche alles“.</w:t>
+      </w:r>
+      <w:r>
+        <w:rPr>
+          <w:b w:val="0"/>
+        </w:rPr>
+        <w:t xml:space="preserve"/>
+      </w:r>
+    </w:p>
+    <w:p>
+      <w:pPr>
+        <w:pStyle w:val="ListBullet"/>
+      </w:pPr>
+      <w:r>
+        <w:rPr>
+          <w:b/>
+        </w:rPr>
+        <w:t xml:space="preserve">Zeichensetzung: „Punkt“, „Komma“, „Fragezeichen“, „Doppelpunkt“, „Klammer auf/zu“, „Anführungszeichen oben/unten“.</w:t>
+      </w:r>
+      <w:r>
+        <w:rPr>
+          <w:b w:val="0"/>
+        </w:rPr>
+        <w:t xml:space="preserve"/>
+      </w:r>
+    </w:p>
+    <w:p>
+      <w:pPr>
+        <w:pStyle w:val="ListBullet"/>
+      </w:pPr>
+      <w:r>
+        <w:rPr>
+          <w:b/>
+        </w:rPr>
+        <w:t xml:space="preserve">Weiteres: „neue Zeile“, „neuer Absatz“, „großschreiben“, „kleinschreiben“, „rückgängig“, „einfügen“, „kopieren“, „schließen“.</w:t>
+      </w:r>
+      <w:r>
+        <w:rPr>
+          <w:b w:val="0"/>
+        </w:rPr>
+        <w:t xml:space="preserve"/>
+      </w:r>
+    </w:p>
+    <w:p>
+      <w:pPr>
+        <w:pStyle w:val="Heading2"/>
+      </w:pPr>
+      <w:r>
+        <w:t xml:space="preserve">Das Wörterbuch</w:t>
+      </w:r>
+    </w:p>
+    <w:p>
+      <w:r>
+        <w:rPr>
+          <w:b w:val="0"/>
+        </w:rPr>
+        <w:t xml:space="preserve">Im Wörterbuch hinterlegen Sie eigene Wörter: Namen und Fachbegriffe verbessern die Erkennung, und Sie können optional angeben, wie ein Wort ausgesprochen wird („wenn ich X sage, schreibe Y“).</w:t>
+      </w:r>
+      <w:r>
+        <w:rPr>
+          <w:b/>
+        </w:rPr>
+        <w:t/>
+      </w:r>
+      <w:r>
+        <w:rPr>
+          <w:b w:val="0"/>
+        </w:rPr>
+        <w:t xml:space="preserve"/>
+      </w:r>
+    </w:p>
+    <w:p>
+      <w:pPr>
+        <w:pStyle w:val="ListBullet"/>
+      </w:pPr>
+      <w:r>
+        <w:rPr>
+          <w:b/>
+        </w:rPr>
+        <w:t xml:space="preserve">Suchen &amp; Hinzufügen: Tippen Sie links ein Wort – die Liste filtert sofort, sodass Sie sehen, ob es bereits existiert. Rechts optional die gesprochene Form.</w:t>
+      </w:r>
+      <w:r>
+        <w:rPr>
+          <w:b w:val="0"/>
+        </w:rPr>
+        <w:t xml:space="preserve"/>
+      </w:r>
+    </w:p>
+    <w:p>
+      <w:pPr>
+        <w:pStyle w:val="ListBullet"/>
+      </w:pPr>
+      <w:r>
+        <w:rPr>
+          <w:b/>
+        </w:rPr>
+        <w:t xml:space="preserve">Bearbeiten: Doppelklick auf eine Zelle. Die Herkunft jedes Eintrags (von mir, gelernt, importiert, korrigiert) steht rechts; unten lässt sich danach filtern.</w:t>
+      </w:r>
+      <w:r>
+        <w:rPr>
+          <w:b w:val="0"/>
+        </w:rPr>
+        <w:t xml:space="preserve"/>
+      </w:r>
+    </w:p>
+    <w:p>
+      <w:pPr>
+        <w:pStyle w:val="ListBullet"/>
+      </w:pPr>
+      <w:r>
+        <w:rPr>
+          <w:b/>
+        </w:rPr>
+        <w:t xml:space="preserve">Aus Text lernen: Fügen Sie einen Text ein – WithEase schlägt Fachbegriffe und Namen vor. Nur angehakte Einträge werden übernommen (gewöhnliche Wörter sind bewusst nicht vorausgewählt).</w:t>
+      </w:r>
+      <w:r>
+        <w:rPr>
+          <w:b w:val="0"/>
+        </w:rPr>
+        <w:t xml:space="preserve"/>
+      </w:r>
+    </w:p>
+    <w:p>
+      <w:pPr>
+        <w:pStyle w:val="ListBullet"/>
+      </w:pPr>
+      <w:r>
+        <w:rPr>
+          <w:b/>
+        </w:rPr>
+        <w:t xml:space="preserve">Export/Import: Sichern Sie Ihr Wörterbuch als Textdatei oder spielen Sie eine ein. „Kategorie leeren“ entfernt alle angezeigten Einträge auf einmal.</w:t>
+      </w:r>
+      <w:r>
+        <w:rPr>
+          <w:b w:val="0"/>
+        </w:rPr>
+        <w:t xml:space="preserve"/>
+      </w:r>
+    </w:p>
+    <w:p>
+      <w:pPr>
+        <w:pStyle w:val="Heading2"/>
+      </w:pPr>
+      <w:r>
+        <w:t>KI-Funktionen (optional)</w:t>
+      </w:r>
+    </w:p>
+    <w:p>
+      <w:pPr/>
+      <w:r>
+        <w:t>Auf Wunsch hilft Ihnen eine KI beim Aufbereiten des diktierten Textes. Dafür wird entweder ein lokaler KI-Dienst (Ollama) auf diesem PC oder ein Cloud-Zugang benötigt. Ohne KI funktioniert das Diktieren ganz normal weiter.</w:t>
+      </w:r>
+    </w:p>
+    <w:p>
+      <w:pPr>
+        <w:pStyle w:val="ListBullet"/>
+      </w:pPr>
+      <w:r>
+        <w:t>KI-Aktionen: Frei belegbare Schaltflächen am linken Rand des Diktierfensters – jede mit einem eigenen Auftrag (z. B. „Als E-Mail formulieren“ oder „In Stichpunkte“). Ein Klick wendet den Auftrag auf den aktuellen Text an. Reihenfolge und Text bearbeiten Sie über „KI-Aktionen“ in den Einstellungen (oder per Rechtsklick auf einen Button).</w:t>
+      </w:r>
+    </w:p>
+    <w:p>
+      <w:pPr>
+        <w:pStyle w:val="ListBullet"/>
+      </w:pPr>
+      <w:r>
+        <w:t>KI-Vorschau: Nach einer KI-Aktion sehen Sie das Ergebnis mit farblich hervorgehobenen Änderungen und übernehmen es erst nach Ihrer Bestätigung – Ihr Originaltext geht also nie ungefragt verloren.</w:t>
+      </w:r>
+    </w:p>
+    <w:p>
+      <w:pPr>
+        <w:pStyle w:val="ListBullet"/>
+      </w:pPr>
+      <w:r>
+        <w:t>KI-Nachbearbeitung: Optionale automatische Bereinigung nach jedem Diktat. Standardmäßig aus, da sie etwas Wartezeit kostet – für gelegentliches Aufräumen genügen die KI-Aktionen.</w:t>
+      </w:r>
+    </w:p>
+    <w:p>
+      <w:pPr>
+        <w:pStyle w:val="Heading2"/>
+      </w:pPr>
+      <w:r>
+        <w:t xml:space="preserve">Korrekturen richtig nutzen</w:t>
+      </w:r>
+    </w:p>
+    <w:p>
+      <w:r>
+        <w:rPr>
+          <w:b w:val="0"/>
+        </w:rPr>
+        <w:t xml:space="preserve">Wird ein Wort falsch erkannt, haben Sie zwei Möglichkeiten – mit unterschiedlichem Verhalten:</w:t>
+      </w:r>
+      <w:r>
+        <w:rPr>
+          <w:b/>
+        </w:rPr>
+        <w:t/>
+      </w:r>
+      <w:r>
+        <w:rPr>
+          <w:b w:val="0"/>
+        </w:rPr>
+        <w:t xml:space="preserve"/>
+      </w:r>
+    </w:p>
+    <w:p>
+      <w:pPr>
+        <w:pStyle w:val="ListBullet"/>
+      </w:pPr>
+      <w:r>
+        <w:rPr>
+          <w:b/>
+        </w:rPr>
+        <w:t xml:space="preserve">Manuell überschreiben (Wort markieren und neu sprechen oder tippen): Korrigiert nur diese eine Stelle und lernt nichts.</w:t>
+      </w:r>
+      <w:r>
+        <w:rPr>
+          <w:b w:val="0"/>
+        </w:rPr>
+        <w:t xml:space="preserve"/>
+      </w:r>
+    </w:p>
+    <w:p>
+      <w:pPr>
+        <w:pStyle w:val="ListBullet"/>
+      </w:pPr>
+      <w:r>
+        <w:rPr>
+          <w:b/>
+        </w:rPr>
+        <w:t xml:space="preserve">„korrigiere das“ (oder „ersetze A durch B“): Korrigiert die Stelle und merkt sich den Verhörer.</w:t>
+      </w:r>
+      <w:r>
+        <w:rPr>
+          <w:b w:val="0"/>
+        </w:rPr>
+        <w:t xml:space="preserve"/>
+      </w:r>
+    </w:p>
+    <w:p>
+      <w:r>
+        <w:rPr>
+          <w:b w:val="0"/>
+        </w:rPr>
+        <w:t xml:space="preserve">Warum „korrigiere das“ nicht verschlimmbessert: Ein einzelnes „korrigiere das“ greift nicht automatisch in künftige Diktate ein – es merkt sich den Fehler nur. Erst wenn derselbe Verhörer ein zweites Mal auftritt und Sie ihn erneut korrigieren, wird die Regel dauerhaft aktiv. Ersetzt wird nur das exakte Wort. Und die Funktion ist selbst-heilend: Ersetzt eine Regel einmal versehentlich ein gewolltes Wort und Sie korrigieren es zurück, wird die Regel wieder vergessen.</w:t>
+      </w:r>
+      <w:r>
+        <w:rPr>
+          <w:b/>
+        </w:rPr>
+        <w:t/>
+      </w:r>
+      <w:r>
+        <w:rPr>
+          <w:b w:val="0"/>
+        </w:rPr>
+        <w:t xml:space="preserve"/>
+      </w:r>
+    </w:p>
+    <w:p>
+      <w:r>
+        <w:rPr>
+          <w:b w:val="0"/>
+        </w:rPr>
+        <w:t xml:space="preserve">Faustregel:</w:t>
+      </w:r>
+      <w:r>
+        <w:rPr>
+          <w:b/>
+        </w:rPr>
+        <w:t/>
+      </w:r>
+      <w:r>
+        <w:rPr>
+          <w:b w:val="0"/>
+        </w:rPr>
+        <w:t xml:space="preserve"/>
+      </w:r>
+    </w:p>
+    <w:p>
+      <w:pPr>
+        <w:pStyle w:val="ListBullet"/>
+      </w:pPr>
+      <w:r>
+        <w:rPr>
+          <w:b/>
+        </w:rPr>
+        <w:t xml:space="preserve">Einmaliger Ausrutscher: egal – „korrigiere das“ ist sicher, oder einfach manuell überschreiben.</w:t>
+      </w:r>
+      <w:r>
+        <w:rPr>
+          <w:b w:val="0"/>
+        </w:rPr>
+        <w:t xml:space="preserve"/>
+      </w:r>
+    </w:p>
+    <w:p>
+      <w:pPr>
+        <w:pStyle w:val="ListBullet"/>
+      </w:pPr>
+      <w:r>
+        <w:rPr>
+          <w:b/>
+        </w:rPr>
+        <w:t xml:space="preserve">Ein Wort kommt immer wieder falsch heraus (Name, Fachbegriff): „korrigiere das“ – ab dem zweiten Mal wird es automatisch korrigiert.</w:t>
+      </w:r>
+      <w:r>
+        <w:rPr>
+          <w:b w:val="0"/>
+        </w:rPr>
+        <w:t xml:space="preserve"/>
+      </w:r>
+    </w:p>
+    <w:p>
+      <w:pPr>
+        <w:pStyle w:val="ListBullet"/>
+      </w:pPr>
+      <w:r>
+        <w:rPr>
+          <w:b/>
+        </w:rPr>
+        <w:t xml:space="preserve">Der Verhörer ist ein Wort, das Sie regelmäßig auch wirklich meinen: lieber manuell überschreiben.</w:t>
+      </w:r>
+      <w:r>
+        <w:rPr>
+          <w:b w:val="0"/>
+        </w:rPr>
+        <w:t xml:space="preserve"/>
+      </w:r>
+    </w:p>
+    <w:p>
+      <w:pPr>
+        <w:pStyle w:val="ListBullet"/>
+      </w:pPr>
+      <w:r>
+        <w:rPr>
+          <w:b/>
+        </w:rPr>
+        <w:t xml:space="preserve">Der Verhörer ist Kauderwelsch (z. B. „Kaser“ statt „Cursor“): immer „korrigiere das“ – „Kaser“ möchten Sie ja nie schreiben.</w:t>
+      </w:r>
+      <w:r>
+        <w:rPr>
+          <w:b w:val="0"/>
+        </w:rPr>
+        <w:t xml:space="preserve"/>
+      </w:r>
+    </w:p>
+    <w:p>
+      <w:r>
+        <w:rPr>
+          <w:b w:val="0"/>
+        </w:rPr>
+        <w:t xml:space="preserve">Beispiel: Aus „Spalte“ wird „Spalter“. Da „Spalter“ ein echtes Wort ist und es ein Einzelfall war, überschreiben Sie es am besten manuell. „korrigiere das“ heben Sie sich für Wörter auf, die Ihnen wiederholt falsch herauskommen.</w:t>
+      </w:r>
+      <w:r>
+        <w:rPr>
+          <w:b/>
+        </w:rPr>
+        <w:t/>
+      </w:r>
+      <w:r>
+        <w:rPr>
+          <w:b w:val="0"/>
+        </w:rPr>
+        <w:t xml:space="preserve"/>
+      </w:r>
+    </w:p>
+    <w:p>
+      <w:r>
+        <w:rPr>
+          <w:b w:val="0"/>
+        </w:rPr>
+        <w:t xml:space="preserve">Verwalten: Gelernte Korrekturen erscheinen im Wörterbuch unter der Kategorie „korrigiert“ und lassen sich dort jederzeit bearbeiten oder entfernen.</w:t>
+      </w:r>
+      <w:r>
+        <w:rPr>
+          <w:b/>
+        </w:rPr>
+        <w:t/>
+      </w:r>
+      <w:r>
+        <w:rPr>
+          <w:b w:val="0"/>
+        </w:rPr>
+        <w:t xml:space="preserve"/>
+      </w:r>
+    </w:p>
+    <w:p>
+      <w:pPr>
+        <w:pStyle w:val="Heading1"/>
+      </w:pPr>
+      <w:r>
+        <w:t xml:space="preserve">13. Über, Feedback &amp; Teilen</w:t>
       </w:r>
     </w:p>
     <w:p>
@@ -2876,7 +3566,7 @@
         <w:pStyle w:val="Heading1"/>
       </w:pPr>
       <w:r>
-        <w:t>13. Tipps &amp; Problemlösung</w:t>
+        <w:t xml:space="preserve">14. Tipps &amp; Problemlösung</w:t>
       </w:r>
     </w:p>
     <w:p>
@@ -3064,7 +3754,7 @@
         <w:pStyle w:val="Heading1"/>
       </w:pPr>
       <w:r>
-        <w:t>14. Hilfe &amp; Kontakt</w:t>
+        <w:t xml:space="preserve">15. Hilfe &amp; Kontakt</w:t>
       </w:r>
     </w:p>
     <w:p>

</xml_diff>

<commit_message>
docs(dictation): informal du-form manual + remove in-app beta note
Manual (WithEase-Anleitung.docx):
- switch the whole guide from formal Sie to informal du
- drop the Linux (Beta) install + troubleshooting; note a Linux version
  is only being considered for the future; subtitle now Windows-only
- emergency-stop tip: also handy to quickly disable WithEase when someone
  else uses the PC
- dictation "Ziel-App wählen": clarify it is normally unnecessary since the
  active window is captured automatically
- add a Ko-fi support bullet to the About/Feedback chapter
- refresh the About-page screenshot (Ko-fi button + feedback hint)

Module: remove the in-app beta note from the dictation settings page

Co-Authored-By: Claude Opus 4.8 <noreply@anthropic.com>
</commit_message>
<xml_diff>
--- a/docs/WithEase-Anleitung.docx
+++ b/docs/WithEase-Anleitung.docx
@@ -83,11 +83,7 @@
         <w:jc w:val="center"/>
       </w:pPr>
       <w:r>
-        <w:rPr>
-          <w:color w:val="555555"/>
-          <w:sz w:val="22"/>
-        </w:rPr>
-        <w:t>Windows &amp; Linux · kostenlos und quelloffen (MIT)</w:t>
+        <w:t>Windows · kostenlos und quelloffen (MIT)</w:t>
       </w:r>
     </w:p>
     <w:p>
@@ -108,10 +104,7 @@
         <w:jc w:val="center"/>
       </w:pPr>
       <w:r>
-        <w:rPr>
-          <w:color w:val="555555"/>
-        </w:rPr>
-        <w:t>Diese Anleitung erklärt Schritt für Schritt, wie Sie WithEase installieren, einrichten und im Alltag nutzen.</w:t>
+        <w:t>Diese Anleitung erklärt Schritt für Schritt, wie du WithEase installierst, einrichtest und im Alltag nutzt.</w:t>
       </w:r>
     </w:p>
     <w:p>
@@ -250,10 +243,7 @@
     </w:p>
     <w:p>
       <w:r>
-        <w:rPr>
-          <w:b w:val="0"/>
-        </w:rPr>
-        <w:t>Genau deshalb ist mir Ihre Rückmeldung wichtig: Sie hilft, WithEase Schritt für Schritt besser zu machen.</w:t>
+        <w:t>Genau deshalb ist mir deine Rückmeldung wichtig: sie hilft, WithEase Schritt für Schritt besser zu machen.</w:t>
       </w:r>
     </w:p>
     <w:p>
@@ -271,9 +261,6 @@
     </w:p>
     <w:p>
       <w:r>
-        <w:rPr>
-          <w:b w:val="0"/>
-        </w:rPr>
         <w:t xml:space="preserve">WithEase ist ein kleines Hilfsprogramm, das Menschen mit eingeschränkter Feinmotorik die Bedienung von </w:t>
       </w:r>
       <w:r>
@@ -283,17 +270,11 @@
         <w:t>Maus und Tastatur</w:t>
       </w:r>
       <w:r>
-        <w:rPr>
-          <w:b w:val="0"/>
-        </w:rPr>
-        <w:t xml:space="preserve"> erleichtert. Es läuft unauffällig im Hintergrund (im System-Tray, unten rechts neben der Uhr) und greift nur dort ein, wo Sie es wünschen.</w:t>
+        <w:t xml:space="preserve"> erleichtert. Es läuft unauffällig im Hintergrund (im System-Tray, unten rechts neben der Uhr) und greift nur dort ein, wo du es möchtest.</w:t>
       </w:r>
     </w:p>
     <w:p>
       <w:r>
-        <w:rPr>
-          <w:b w:val="0"/>
-        </w:rPr>
         <w:t xml:space="preserve">Jede Funktion ist ein eigenes </w:t>
       </w:r>
       <w:r>
@@ -303,10 +284,7 @@
         <w:t>Modul</w:t>
       </w:r>
       <w:r>
-        <w:rPr>
-          <w:b w:val="0"/>
-        </w:rPr>
-        <w:t xml:space="preserve"> und lässt sich einzeln ein- und ausschalten. So bleibt das Programm übersichtlich und tut genau das, was Sie brauchen – nicht mehr.</w:t>
+        <w:t xml:space="preserve"> und lässt sich einzeln ein- und ausschalten. So bleibt das Programm übersichtlich und tut genau das, was du brauchst – nicht mehr.</w:t>
       </w:r>
     </w:p>
     <w:p>
@@ -485,10 +463,7 @@
         </w:numPr>
       </w:pPr>
       <w:r>
-        <w:rPr>
-          <w:b w:val="0"/>
-        </w:rPr>
-        <w:t xml:space="preserve">Öffnen Sie die </w:t>
+        <w:t xml:space="preserve">Öffne die </w:t>
       </w:r>
       <w:r>
         <w:rPr>
@@ -497,9 +472,6 @@
         <w:t>Releases</w:t>
       </w:r>
       <w:r>
-        <w:rPr>
-          <w:b w:val="0"/>
-        </w:rPr>
         <w:t>-Seite von WithEase auf GitHub.</w:t>
       </w:r>
     </w:p>
@@ -512,10 +484,7 @@
         </w:numPr>
       </w:pPr>
       <w:r>
-        <w:rPr>
-          <w:b w:val="0"/>
-        </w:rPr>
-        <w:t xml:space="preserve">Laden Sie die Datei </w:t>
+        <w:t xml:space="preserve">Lade die Datei </w:t>
       </w:r>
       <w:r>
         <w:rPr>
@@ -524,9 +493,6 @@
         <w:t>WithEase-&lt;Version&gt;-win64.zip</w:t>
       </w:r>
       <w:r>
-        <w:rPr>
-          <w:b w:val="0"/>
-        </w:rPr>
         <w:t xml:space="preserve"> herunter.</w:t>
       </w:r>
     </w:p>
@@ -560,10 +526,7 @@
         </w:numPr>
       </w:pPr>
       <w:r>
-        <w:rPr>
-          <w:b w:val="0"/>
-        </w:rPr>
-        <w:t xml:space="preserve">Öffnen Sie den entpackten Ordner </w:t>
+        <w:t xml:space="preserve">Öffne den entpackten Ordner </w:t>
       </w:r>
       <w:r>
         <w:rPr>
@@ -572,10 +535,7 @@
         <w:t>WithEase</w:t>
       </w:r>
       <w:r>
-        <w:rPr>
-          <w:b w:val="0"/>
-        </w:rPr>
-        <w:t xml:space="preserve"> und starten Sie </w:t>
+        <w:t xml:space="preserve"> und starte </w:t>
       </w:r>
       <w:r>
         <w:rPr>
@@ -584,9 +544,6 @@
         <w:t>WithEase.exe</w:t>
       </w:r>
       <w:r>
-        <w:rPr>
-          <w:b w:val="0"/>
-        </w:rPr>
         <w:t xml:space="preserve"> per Doppelklick.</w:t>
       </w:r>
     </w:p>
@@ -678,10 +635,7 @@
     <w:p/>
     <w:p>
       <w:r>
-        <w:rPr>
-          <w:b w:val="0"/>
-        </w:rPr>
-        <w:t>WithEase startet danach im System-Tray. Es werden keine Administratorrechte benötigt. Ihre Einstellungen liegen unter %APPDATA%\WithEase.</w:t>
+        <w:t>WithEase startet danach im System-Tray. Es werden keine Administratorrechte benötigt. Deine Einstellungen liegen unter %APPDATA%\WithEase.</w:t>
       </w:r>
     </w:p>
     <w:p>
@@ -689,39 +643,12 @@
         <w:pStyle w:val="Heading2"/>
       </w:pPr>
       <w:r>
-        <w:t>Linux (Beta)</w:t>
+        <w:t>Linux</w:t>
       </w:r>
     </w:p>
     <w:p>
       <w:r>
-        <w:rPr>
-          <w:b w:val="0"/>
-        </w:rPr>
-        <w:t xml:space="preserve">Laden Sie </w:t>
-      </w:r>
-      <w:r>
-        <w:rPr>
-          <w:b/>
-        </w:rPr>
-        <w:t>WithEase-&lt;Version&gt;-linux64.tar.gz</w:t>
-      </w:r>
-      <w:r>
-        <w:rPr>
-          <w:b w:val="0"/>
-        </w:rPr>
-        <w:t xml:space="preserve"> herunter, entpacken Sie es mit tar -xzf … und starten Sie ./WithEase/WithEase. Verwenden Sie möglichst eine </w:t>
-      </w:r>
-      <w:r>
-        <w:rPr>
-          <w:b/>
-        </w:rPr>
-        <w:t>X11/Xorg</w:t>
-      </w:r>
-      <w:r>
-        <w:rPr>
-          <w:b w:val="0"/>
-        </w:rPr>
-        <w:t>-Sitzung – unter Wayland sperrt das System die globale Tastaturerkennung, dann funktionieren einige Funktionen nicht.</w:t>
+        <w:t>Eine eigene Linux-Version gibt es derzeit noch nicht. Sie wird für die Zukunft aber in Betracht gezogen.</w:t>
       </w:r>
     </w:p>
     <w:p>
@@ -739,10 +666,7 @@
     </w:p>
     <w:p>
       <w:r>
-        <w:rPr>
-          <w:b w:val="0"/>
-        </w:rPr>
-        <w:t xml:space="preserve">Nach dem Start finden Sie das WithEase-Symbol im </w:t>
+        <w:t xml:space="preserve">Nach dem Start findest du das WithEase-Symbol im </w:t>
       </w:r>
       <w:r>
         <w:rPr>
@@ -751,9 +675,6 @@
         <w:t>System-Tray</w:t>
       </w:r>
       <w:r>
-        <w:rPr>
-          <w:b w:val="0"/>
-        </w:rPr>
         <w:t xml:space="preserve"> (unten rechts, ggf. hinter dem kleinen Pfeil „^“).</w:t>
       </w:r>
     </w:p>
@@ -984,10 +905,7 @@
     </w:p>
     <w:p>
       <w:r>
-        <w:rPr>
-          <w:b w:val="0"/>
-        </w:rPr>
-        <w:t>Hier stellen Sie ein, wie WithEase aussieht und startet.</w:t>
+        <w:t>Hier stellst du ein, wie WithEase aussieht und startet.</w:t>
       </w:r>
     </w:p>
     <w:p>
@@ -1164,10 +1082,7 @@
     </w:p>
     <w:p>
       <w:r>
-        <w:rPr>
-          <w:b w:val="0"/>
-        </w:rPr>
-        <w:t xml:space="preserve">Der Notfall-Stop ist Ihr </w:t>
+        <w:t xml:space="preserve">Der Notfall-Stop ist dein </w:t>
       </w:r>
       <w:r>
         <w:rPr>
@@ -1176,9 +1091,6 @@
         <w:t>Rettungsanker</w:t>
       </w:r>
       <w:r>
-        <w:rPr>
-          <w:b w:val="0"/>
-        </w:rPr>
         <w:t>. Ein Druck auf die zugewiesene Taste (oder ein Klick auf den roten Knopf unten links):</w:t>
       </w:r>
     </w:p>
@@ -1230,31 +1142,31 @@
     </w:p>
     <w:p>
       <w:r>
-        <w:rPr>
-          <w:b w:val="0"/>
-        </w:rPr>
-        <w:t>Ein erneuter Druck auf dieselbe Taste schaltet alles wieder ein. Nutzen Sie ihn immer dann, wenn sich die Tastatur oder die Maus unerwartet verhält.</w:t>
+        <w:t>Ein erneuter Druck auf dieselbe Taste schaltet alles wieder ein. Nutze ihn immer dann, wenn sich die Tastatur oder die Maus unerwartet verhält.</w:t>
       </w:r>
     </w:p>
     <w:p>
-      <w:r>
-        <w:br w:type="page"/>
+      <w:pPr/>
+      <w:r>
+        <w:t>Tipp: Du kannst den Notfall-Stop auch nutzen, um WithEase im Handumdrehen komplett stillzulegen – zum Beispiel, wenn jemand anderes kurz an deinen PC geht, der die Hilfen von WithEase nicht braucht. Dann verhält sich der Rechner ganz normal, bis du den Notfall-Stop erneut drückst.</w:t>
       </w:r>
     </w:p>
     <w:p>
-      <w:pPr>
-        <w:pStyle w:val="Heading1"/>
-      </w:pPr>
-      <w:r>
-        <w:t>6. Maus-Modul</w:t>
+      <w:r>
+        <w:br w:type="page"/>
       </w:r>
     </w:p>
     <w:p>
-      <w:r>
-        <w:rPr>
-          <w:b w:val="0"/>
-        </w:rPr>
-        <w:t xml:space="preserve">Setzen Sie oben das Häkchen bei </w:t>
+      <w:pPr>
+        <w:pStyle w:val="Heading1"/>
+      </w:pPr>
+      <w:r>
+        <w:t>6. Maus-Modul</w:t>
+      </w:r>
+    </w:p>
+    <w:p>
+      <w:r>
+        <w:t xml:space="preserve">Setze oben das Häkchen bei </w:t>
       </w:r>
       <w:r>
         <w:rPr>
@@ -1263,10 +1175,7 @@
         <w:t>Mausmodul aktivieren</w:t>
       </w:r>
       <w:r>
-        <w:rPr>
-          <w:b w:val="0"/>
-        </w:rPr>
-        <w:t>. Danach können Sie jede Funktion einzeln einschalten – erst dann klappen ihre Einstellungen auf.</w:t>
+        <w:t>. Danach kannst du jede Funktion einzeln einschalten – erst dann klappen ihre Einstellungen auf.</w:t>
       </w:r>
     </w:p>
     <w:p>
@@ -1340,10 +1249,7 @@
         <w:t>Cursor-Zentrierung:</w:t>
       </w:r>
       <w:r>
-        <w:rPr>
-          <w:b w:val="0"/>
-        </w:rPr>
-        <w:t xml:space="preserve"> Nach einer einstellbaren Pause ohne Eingabe springt der Mauszeiger in die Bildschirmmitte – so finden Sie ihn immer wieder.</w:t>
+        <w:t xml:space="preserve"> Nach einer einstellbaren Pause ohne Eingabe springt der Mauszeiger in die Bildschirmmitte – so findest du ihn immer wieder.</w:t>
       </w:r>
     </w:p>
     <w:p>
@@ -1374,10 +1280,7 @@
         <w:t>Click-Lock:</w:t>
       </w:r>
       <w:r>
-        <w:rPr>
-          <w:b w:val="0"/>
-        </w:rPr>
-        <w:t xml:space="preserve"> Hält die linke Maustaste gedrückt, ohne dass Sie sie halten müssen – zum Ziehen und Markieren.</w:t>
+        <w:t xml:space="preserve"> Hält die linke Maustaste gedrückt, ohne dass du sie halten musst – zum Ziehen und Markieren.</w:t>
       </w:r>
     </w:p>
     <w:p>
@@ -1391,10 +1294,7 @@
         <w:t>Cursor hervorheben:</w:t>
       </w:r>
       <w:r>
-        <w:rPr>
-          <w:b w:val="0"/>
-        </w:rPr>
-        <w:t xml:space="preserve"> Pulsierende Ringe um den Zeiger, damit Sie ihn sofort sehen.</w:t>
+        <w:t xml:space="preserve"> Pulsierende Ringe um den Zeiger, damit du ihn sofort siehst.</w:t>
       </w:r>
     </w:p>
     <w:p>
@@ -1446,10 +1346,7 @@
     </w:p>
     <w:p>
       <w:r>
-        <w:rPr>
-          <w:b w:val="0"/>
-        </w:rPr>
-        <w:t xml:space="preserve">Aktivieren Sie </w:t>
+        <w:t xml:space="preserve">Aktiviere </w:t>
       </w:r>
       <w:r>
         <w:rPr>
@@ -1458,9 +1355,6 @@
         <w:t>Mausmodul</w:t>
       </w:r>
       <w:r>
-        <w:rPr>
-          <w:b w:val="0"/>
-        </w:rPr>
         <w:t xml:space="preserve"> und dann </w:t>
       </w:r>
       <w:r>
@@ -1470,9 +1364,6 @@
         <w:t>Cursor-Zentrierung</w:t>
       </w:r>
       <w:r>
-        <w:rPr>
-          <w:b w:val="0"/>
-        </w:rPr>
         <w:t>. Es klappen die Einstellungen auf:</w:t>
       </w:r>
     </w:p>
@@ -1671,9 +1562,6 @@
     </w:p>
     <w:p>
       <w:r>
-        <w:rPr>
-          <w:b w:val="0"/>
-        </w:rPr>
         <w:t xml:space="preserve">Unterdrückt unbeabsichtigte </w:t>
       </w:r>
       <w:r>
@@ -1683,10 +1571,7 @@
         <w:t>Mehrfachanschläge</w:t>
       </w:r>
       <w:r>
-        <w:rPr>
-          <w:b w:val="0"/>
-        </w:rPr>
-        <w:t>: Nach einem Tastendruck wird dieselbe Taste für eine einstellbare Zeit ignoriert (z. B. 500 ms). Einzelne Tasten können Sie als Ausnahme eintragen.</w:t>
+        <w:t>: Nach einem Tastendruck wird dieselbe Taste für eine einstellbare Zeit ignoriert (z. B. 500 ms). Einzelne Tasten kannst du als Ausnahme eintragen.</w:t>
       </w:r>
     </w:p>
     <w:p>
@@ -1699,10 +1584,7 @@
     </w:p>
     <w:p>
       <w:r>
-        <w:rPr>
-          <w:b w:val="0"/>
-        </w:rPr>
-        <w:t xml:space="preserve">Damit müssen Sie </w:t>
+        <w:t xml:space="preserve">Damit musst du </w:t>
       </w:r>
       <w:r>
         <w:rPr>
@@ -1711,22 +1593,7 @@
         <w:t>keine zwei Tasten gleichzeitig</w:t>
       </w:r>
       <w:r>
-        <w:rPr>
-          <w:b w:val="0"/>
-        </w:rPr>
-        <w:t xml:space="preserve"> halten. Sie </w:t>
-      </w:r>
-      <w:r>
-        <w:rPr>
-          <w:b/>
-        </w:rPr>
-        <w:t>tippen den Modifier kurz an</w:t>
-      </w:r>
-      <w:r>
-        <w:rPr>
-          <w:b w:val="0"/>
-        </w:rPr>
-        <w:t xml:space="preserve"> (Umschalt, Strg, Alt, AltGr oder Win) – er bleibt vorgemerkt und gilt für die </w:t>
+        <w:t xml:space="preserve"> halten. Du tippst den Modifier kurz an (Umschalt, Strg, Alt, AltGr oder Win) – er bleibt vorgemerkt und gilt für die </w:t>
       </w:r>
       <w:r>
         <w:rPr>
@@ -1735,9 +1602,6 @@
         <w:t>nächste Taste</w:t>
       </w:r>
       <w:r>
-        <w:rPr>
-          <w:b w:val="0"/>
-        </w:rPr>
         <w:t>, danach löst er sich automatisch wieder.</w:t>
       </w:r>
     </w:p>
@@ -1934,10 +1798,7 @@
     </w:p>
     <w:p>
       <w:r>
-        <w:rPr>
-          <w:b w:val="0"/>
-        </w:rPr>
-        <w:t xml:space="preserve">Mit Makros fügen Sie auf Tastendruck </w:t>
+        <w:t xml:space="preserve">Mit Makros fügst du auf Tastendruck </w:t>
       </w:r>
       <w:r>
         <w:rPr>
@@ -1946,10 +1807,7 @@
         <w:t>Textbausteine</w:t>
       </w:r>
       <w:r>
-        <w:rPr>
-          <w:b w:val="0"/>
-        </w:rPr>
-        <w:t xml:space="preserve"> ein, senden Tastenkombinationen oder starten Programme.</w:t>
+        <w:t xml:space="preserve"> ein, sendest Tastenkombinationen oder startest Programme.</w:t>
       </w:r>
     </w:p>
     <w:p>
@@ -1969,10 +1827,7 @@
         </w:numPr>
       </w:pPr>
       <w:r>
-        <w:rPr>
-          <w:b w:val="0"/>
-        </w:rPr>
-        <w:t xml:space="preserve">Sie drücken die </w:t>
+        <w:t xml:space="preserve">Du drückst die </w:t>
       </w:r>
       <w:r>
         <w:rPr>
@@ -1981,9 +1836,6 @@
         <w:t>Auslösetaste</w:t>
       </w:r>
       <w:r>
-        <w:rPr>
-          <w:b w:val="0"/>
-        </w:rPr>
         <w:t xml:space="preserve"> (z. B. F9) → der Makromodus wird aktiv (eine Anzeige erscheint).</w:t>
       </w:r>
     </w:p>
@@ -1996,10 +1848,7 @@
         </w:numPr>
       </w:pPr>
       <w:r>
-        <w:rPr>
-          <w:b w:val="0"/>
-        </w:rPr>
-        <w:t xml:space="preserve">Sie drücken die </w:t>
+        <w:t xml:space="preserve">Du drückst die </w:t>
       </w:r>
       <w:r>
         <w:rPr>
@@ -2008,9 +1857,6 @@
         <w:t>Makro-Taste</w:t>
       </w:r>
       <w:r>
-        <w:rPr>
-          <w:b w:val="0"/>
-        </w:rPr>
         <w:t xml:space="preserve"> (z. B. Num 1).</w:t>
       </w:r>
     </w:p>
@@ -2039,10 +1885,7 @@
     </w:p>
     <w:p>
       <w:r>
-        <w:rPr>
-          <w:b w:val="0"/>
-        </w:rPr>
-        <w:t xml:space="preserve">Gehen Sie auf </w:t>
+        <w:t xml:space="preserve">Geh auf </w:t>
       </w:r>
       <w:r>
         <w:rPr>
@@ -2051,9 +1894,6 @@
         <w:t>Makros</w:t>
       </w:r>
       <w:r>
-        <w:rPr>
-          <w:b w:val="0"/>
-        </w:rPr>
         <w:t xml:space="preserve"> → </w:t>
       </w:r>
       <w:r>
@@ -2063,10 +1903,7 @@
         <w:t>Makro hinzufügen</w:t>
       </w:r>
       <w:r>
-        <w:rPr>
-          <w:b w:val="0"/>
-        </w:rPr>
-        <w:t xml:space="preserve">. Vergeben Sie einen Namen, zeichnen Sie die </w:t>
+        <w:t xml:space="preserve">. Vergib einen Namen, zeichne die </w:t>
       </w:r>
       <w:r>
         <w:rPr>
@@ -2075,10 +1912,7 @@
         <w:t>Taste</w:t>
       </w:r>
       <w:r>
-        <w:rPr>
-          <w:b w:val="0"/>
-        </w:rPr>
-        <w:t xml:space="preserve"> auf und wählen Sie den Typ.</w:t>
+        <w:t xml:space="preserve"> auf und wähle den Typ.</w:t>
       </w:r>
     </w:p>
     <w:p>
@@ -2152,9 +1986,6 @@
         <w:t>Text eingeben:</w:t>
       </w:r>
       <w:r>
-        <w:rPr>
-          <w:b w:val="0"/>
-        </w:rPr>
         <w:t xml:space="preserve"> Fügt einen beliebigen Text ein – auch </w:t>
       </w:r>
       <w:r>
@@ -2164,10 +1995,7 @@
         <w:t>mehrzeilig</w:t>
       </w:r>
       <w:r>
-        <w:rPr>
-          <w:b w:val="0"/>
-        </w:rPr>
-        <w:t>, z. B. eine komplette E-Mail-Vorlage oder Ihre Signatur.</w:t>
+        <w:t>, z. B. eine komplette E-Mail-Vorlage oder deine Signatur.</w:t>
       </w:r>
     </w:p>
     <w:p>
@@ -2293,9 +2121,6 @@
     </w:p>
     <w:p>
       <w:r>
-        <w:rPr>
-          <w:b w:val="0"/>
-        </w:rPr>
         <w:t xml:space="preserve">Profile speichern </w:t>
       </w:r>
       <w:r>
@@ -2305,10 +2130,7 @@
         <w:t>alle Modul-Einstellungen getrennt</w:t>
       </w:r>
       <w:r>
-        <w:rPr>
-          <w:b w:val="0"/>
-        </w:rPr>
-        <w:t xml:space="preserve"> – praktisch, wenn mehrere Personen denselben PC nutzen oder Sie je nach Situation unterschiedliche Hilfen brauchen (z. B. Arbeit, Spielen, Gast).</w:t>
+        <w:t xml:space="preserve"> – praktisch, wenn mehrere Personen denselben PC nutzen oder du je nach Situation unterschiedliche Hilfen brauchst (z. B. Arbeit, Spielen, Gast).</w:t>
       </w:r>
     </w:p>
     <w:p>
@@ -2459,9 +2281,6 @@
     </w:p>
     <w:p>
       <w:r>
-        <w:rPr>
-          <w:b w:val="0"/>
-        </w:rPr>
         <w:t xml:space="preserve">Auf der Seite </w:t>
       </w:r>
       <w:r>
@@ -2471,10 +2290,7 @@
         <w:t>Aktionen</w:t>
       </w:r>
       <w:r>
-        <w:rPr>
-          <w:b w:val="0"/>
-        </w:rPr>
-        <w:t xml:space="preserve"> sehen Sie alle Funktionen und Makros mit ihren Tastenkürzeln auf einen Blick. WithEase hat keine fest verdrahteten Tastenkürzel – Sie können jeder Aktion einen beliebigen Auslöser zuweisen.</w:t>
+        <w:t xml:space="preserve"> siehst du alle Funktionen und Makros mit ihren Tastenkürzeln auf einen Blick. WithEase hat keine fest verdrahteten Tastenkürzel – du kannst jeder Aktion einen beliebigen Auslöser zuweisen.</w:t>
       </w:r>
     </w:p>
     <w:p>
@@ -2534,9 +2350,6 @@
         <w:pStyle w:val="ListBullet"/>
       </w:pPr>
       <w:r>
-        <w:rPr>
-          <w:b w:val="0"/>
-        </w:rPr>
         <w:t xml:space="preserve">Mit dem </w:t>
       </w:r>
       <w:r>
@@ -2546,10 +2359,7 @@
         <w:t>Stern</w:t>
       </w:r>
       <w:r>
-        <w:rPr>
-          <w:b w:val="0"/>
-        </w:rPr>
-        <w:t xml:space="preserve"> markieren Sie Favoriten.</w:t>
+        <w:t xml:space="preserve"> markierst du Favoriten.</w:t>
       </w:r>
     </w:p>
     <w:p>
@@ -2557,9 +2367,6 @@
         <w:pStyle w:val="ListBullet"/>
       </w:pPr>
       <w:r>
-        <w:rPr>
-          <w:b w:val="0"/>
-        </w:rPr>
         <w:t xml:space="preserve">Favoriten erscheinen im </w:t>
       </w:r>
       <w:r>
@@ -2569,10 +2376,7 @@
         <w:t>Overlay</w:t>
       </w:r>
       <w:r>
-        <w:rPr>
-          <w:b w:val="0"/>
-        </w:rPr>
-        <w:t xml:space="preserve"> dauerhaft am Bildschirmrand – so haben Sie Ihre wichtigsten Tasten immer im Blick.</w:t>
+        <w:t xml:space="preserve"> dauerhaft am Bildschirmrand – so hast du deine wichtigsten Tasten immer im Blick.</w:t>
       </w:r>
     </w:p>
     <w:p>
@@ -2601,10 +2405,7 @@
     </w:p>
     <w:p>
       <w:r>
-        <w:rPr>
-          <w:b w:val="0"/>
-        </w:rPr>
-        <w:t xml:space="preserve">Hier erweitern Sie WithEase um zusätzliche Module. Alle gezeigten Module stammen direkt von WithEase und sind geprüft. Ein Klick auf </w:t>
+        <w:t xml:space="preserve">Hier erweiterst du WithEase um zusätzliche Module. Alle gezeigten Module stammen direkt von WithEase und sind geprüft. Ein Klick auf </w:t>
       </w:r>
       <w:r>
         <w:rPr>
@@ -2613,9 +2414,6 @@
         <w:t>Installieren</w:t>
       </w:r>
       <w:r>
-        <w:rPr>
-          <w:b w:val="0"/>
-        </w:rPr>
         <w:t xml:space="preserve"> genügt – nach einem Neustart ist das Modul einsatzbereit.</w:t>
       </w:r>
     </w:p>
@@ -2770,10 +2568,186 @@
     </w:p>
     <w:p>
       <w:r>
+        <w:t>Das Diktier-Modul wandelt gesprochene Sprache in Text um und fügt ihn in die zuvor gewählte Anwendung ein. Du aktivierst es in der Modul-Bibliothek. Datenschutz: Beim Cloud-Backend wird die Aufnahme an den gewählten Anbieter gesendet; beim lokalen Backend bleibt alles auf diesem PC.</w:t>
+      </w:r>
+    </w:p>
+    <w:p>
+      <w:pPr>
+        <w:pStyle w:val="Heading2"/>
+      </w:pPr>
+      <w:r>
+        <w:t>Die Einstellungen im Überblick</w:t>
+      </w:r>
+    </w:p>
+    <w:p>
+      <w:pPr/>
+      <w:r>
+        <w:t>Die Einstellungen des Diktier-Moduls sind in klare Bereiche gegliedert, damit du schnell findest, was du brauchst:</w:t>
+      </w:r>
+    </w:p>
+    <w:p>
+      <w:pPr>
+        <w:pStyle w:val="ListBullet"/>
+      </w:pPr>
+      <w:r>
+        <w:t>Grundeinstellungen: Diktier-Taste, Aufnahmemodus (Umschalten oder Halten) und Sprache.</w:t>
+      </w:r>
+    </w:p>
+    <w:p>
+      <w:pPr>
+        <w:pStyle w:val="ListBullet"/>
+      </w:pPr>
+      <w:r>
+        <w:t>Spracherkennung: Umschalten zwischen Cloud und Lokal – es werden jeweils nur die dazu passenden Felder angezeigt. Hier liegt auch die Schaltfläche zum Testen.</w:t>
+      </w:r>
+    </w:p>
+    <w:p>
+      <w:pPr>
+        <w:pStyle w:val="ListBullet"/>
+      </w:pPr>
+      <w:r>
+        <w:t>Textausgabe: ob der Text zuerst im Diktierfenster erscheint oder direkt eingefügt wird, sowie die Einfüge-Methode (Zwischenablage oder Tippen).</w:t>
+      </w:r>
+    </w:p>
+    <w:p>
+      <w:pPr>
+        <w:pStyle w:val="ListBullet"/>
+      </w:pPr>
+      <w:r>
+        <w:t>Wörterbuch &amp; KI: Dein persönliches Wörterbuch sowie die optionalen KI-Funktionen.</w:t>
+      </w:r>
+    </w:p>
+    <w:p>
+      <w:pPr>
+        <w:pStyle w:val="ListBullet"/>
+      </w:pPr>
+      <w:r>
+        <w:t>Erweitert (standardmäßig eingeklappt): selten benötigte Optionen wie eine eigene Befehlstaste, die Mikrofon-Auswahl, die maximale Aufnahmedauer und die Diagnose-Option „Nur reine Erkennung“.</w:t>
+      </w:r>
+    </w:p>
+    <w:p>
+      <w:pPr>
+        <w:pStyle w:val="Heading2"/>
+      </w:pPr>
+      <w:r>
+        <w:t xml:space="preserve">Die zwei Betriebsarten</w:t>
+      </w:r>
+    </w:p>
+    <w:p>
+      <w:pPr>
+        <w:pStyle w:val="ListBullet"/>
+      </w:pPr>
+      <w:r>
+        <w:rPr>
+          <w:b/>
+        </w:rPr>
+        <w:t xml:space="preserve">Cloud: schnell und ohne eigenes Modell, benötigt aber Internet und einen Zugangsschlüssel. Die Aufnahme wird an den Anbieter geschickt.</w:t>
+      </w:r>
+      <w:r>
         <w:rPr>
           <w:b w:val="0"/>
         </w:rPr>
-        <w:t xml:space="preserve">Das Diktier-Modul wandelt gesprochene Sprache in Text um und fügt ihn in die zuvor gewählte Anwendung ein. Sie aktivieren es in der Modul-Bibliothek. Datenschutz: Beim Cloud-Backend wird die Aufnahme an den gewählten Anbieter gesendet; beim lokalen Backend bleibt alles auf diesem PC.</w:t>
+        <w:t xml:space="preserve"/>
+      </w:r>
+    </w:p>
+    <w:p>
+      <w:pPr>
+        <w:pStyle w:val="ListBullet"/>
+      </w:pPr>
+      <w:r>
+        <w:rPr>
+          <w:b/>
+        </w:rPr>
+        <w:t xml:space="preserve">Lokal (Whisper): läuft vollständig offline auf diesem PC und ist sehr genau. Das Modell wird einmalig geladen.</w:t>
+      </w:r>
+      <w:r>
+        <w:rPr>
+          <w:b w:val="0"/>
+        </w:rPr>
+        <w:t xml:space="preserve"/>
+      </w:r>
+    </w:p>
+    <w:p>
+      <w:pPr>
+        <w:pStyle w:val="Heading2"/>
+      </w:pPr>
+      <w:r>
+        <w:t xml:space="preserve">So diktieren Sie</w:t>
+      </w:r>
+    </w:p>
+    <w:p>
+      <w:pPr>
+        <w:pStyle w:val="ListBullet"/>
+      </w:pPr>
+      <w:r>
+        <w:rPr>
+          <w:b/>
+        </w:rPr>
+        <w:t xml:space="preserve">Diktier-Taste (Hotkey) drücken, sprechen und die Taste erneut drücken. Der erkannte Text erscheint im Diktierfenster.</w:t>
+      </w:r>
+      <w:r>
+        <w:rPr>
+          <w:b w:val="0"/>
+        </w:rPr>
+        <w:t xml:space="preserve"/>
+      </w:r>
+    </w:p>
+    <w:p>
+      <w:pPr>
+        <w:pStyle w:val="ListBullet"/>
+      </w:pPr>
+      <w:r>
+        <w:t>Ziel-App wählen: Normalerweise ist das nicht nötig – WithEase fügt automatisch in das Fenster ein, das beim Start des Diktats aktiv war. Nur wenn du in eine andere Anwendung einfügen möchtest, klickst du auf „Ziel-App wählen“ und dann in das gewünschte Fenster. WithEase merkt sich diese App; das Diktierfenster kommt anschließend automatisch wieder in den Vordergrund, weil dort dein nächster Schritt ist.</w:t>
+      </w:r>
+    </w:p>
+    <w:p>
+      <w:pPr>
+        <w:pStyle w:val="ListBullet"/>
+      </w:pPr>
+      <w:r>
+        <w:rPr>
+          <w:b/>
+        </w:rPr>
+        <w:t xml:space="preserve">„Einfügen“ überträgt den Text in die gemerkte Ziel-App, „Kopieren“ legt ihn in die Zwischenablage.</w:t>
+      </w:r>
+      <w:r>
+        <w:rPr>
+          <w:b w:val="0"/>
+        </w:rPr>
+        <w:t xml:space="preserve"/>
+      </w:r>
+    </w:p>
+    <w:p>
+      <w:pPr>
+        <w:pStyle w:val="Heading2"/>
+      </w:pPr>
+      <w:r>
+        <w:t xml:space="preserve">Lokale Erkennung</w:t>
+      </w:r>
+    </w:p>
+    <w:p>
+      <w:pPr>
+        <w:pStyle w:val="ListBullet"/>
+      </w:pPr>
+      <w:r>
+        <w:rPr>
+          <w:b/>
+        </w:rPr>
+        <w:t xml:space="preserve">Whisper-Modell: „small“ ist schnell, „medium“ deutlich genauer (empfohlen). „large-v3“ nur mit einer starken Grafikkarte.</w:t>
+      </w:r>
+      <w:r>
+        <w:rPr>
+          <w:b w:val="0"/>
+        </w:rPr>
+        <w:t xml:space="preserve"/>
+      </w:r>
+    </w:p>
+    <w:p>
+      <w:r>
+        <w:rPr>
+          <w:b w:val="0"/>
+        </w:rPr>
+        <w:t xml:space="preserve">Tipp: Ein gutes, nah am Mund platziertes Mikrofon (Headset) verbessert die Erkennung mit Abstand am meisten.</w:t>
       </w:r>
       <w:r>
         <w:rPr>
@@ -2793,61 +2767,12 @@
         <w:pStyle w:val="Heading2"/>
       </w:pPr>
       <w:r>
-        <w:t>Die Einstellungen im Überblick</w:t>
+        <w:t xml:space="preserve">Sprachbefehle</w:t>
       </w:r>
     </w:p>
     <w:p>
-      <w:pPr/>
-      <w:r>
-        <w:t>Die Einstellungen des Diktier-Moduls sind in klare Bereiche gegliedert, damit Sie schnell finden, was Sie brauchen:</w:t>
-      </w:r>
-    </w:p>
-    <w:p>
-      <w:pPr>
-        <w:pStyle w:val="ListBullet"/>
-      </w:pPr>
-      <w:r>
-        <w:t>Grundeinstellungen: Diktier-Taste, Aufnahmemodus (Umschalten oder Halten) und Sprache.</w:t>
-      </w:r>
-    </w:p>
-    <w:p>
-      <w:pPr>
-        <w:pStyle w:val="ListBullet"/>
-      </w:pPr>
-      <w:r>
-        <w:t>Spracherkennung: Umschalten zwischen Cloud und Lokal – es werden jeweils nur die dazu passenden Felder angezeigt. Hier liegt auch die Schaltfläche zum Testen.</w:t>
-      </w:r>
-    </w:p>
-    <w:p>
-      <w:pPr>
-        <w:pStyle w:val="ListBullet"/>
-      </w:pPr>
-      <w:r>
-        <w:t>Textausgabe: ob der Text zuerst im Diktierfenster erscheint oder direkt eingefügt wird, sowie die Einfüge-Methode (Zwischenablage oder Tippen).</w:t>
-      </w:r>
-    </w:p>
-    <w:p>
-      <w:pPr>
-        <w:pStyle w:val="ListBullet"/>
-      </w:pPr>
-      <w:r>
-        <w:t>Wörterbuch &amp; KI: Ihr persönliches Wörterbuch sowie die optionalen KI-Funktionen.</w:t>
-      </w:r>
-    </w:p>
-    <w:p>
-      <w:pPr>
-        <w:pStyle w:val="ListBullet"/>
-      </w:pPr>
-      <w:r>
-        <w:t>Erweitert (standardmäßig eingeklappt): selten benötigte Optionen wie eine eigene Befehlstaste, die Mikrofon-Auswahl, die maximale Aufnahmedauer und die Diagnose-Option „Nur reine Erkennung“.</w:t>
-      </w:r>
-    </w:p>
-    <w:p>
-      <w:pPr>
-        <w:pStyle w:val="Heading2"/>
-      </w:pPr>
-      <w:r>
-        <w:t xml:space="preserve">Die zwei Betriebsarten</w:t>
+      <w:r>
+        <w:t>Während des Diktats navigierst und formatierst du mit gesprochenen Befehlen. Tipp: Leg eine zweite „Befehlstaste“ fest – dann gilt die Diktier-Taste immer als Text und die Befehlstaste immer als Befehl.</w:t>
       </w:r>
     </w:p>
     <w:p>
@@ -2858,7 +2783,7 @@
         <w:rPr>
           <w:b/>
         </w:rPr>
-        <w:t xml:space="preserve">Cloud: schnell und ohne eigenes Modell, benötigt aber Internet und einen Zugangsschlüssel. Die Aufnahme wird an den Anbieter geschickt.</w:t>
+        <w:t xml:space="preserve">Cursor setzen: „Cursor vor [Wort]“, „hinter [Wort]“, „an den Anfang“, „ans Ende“.</w:t>
       </w:r>
       <w:r>
         <w:rPr>
@@ -2875,7 +2800,7 @@
         <w:rPr>
           <w:b/>
         </w:rPr>
-        <w:t xml:space="preserve">Lokal (Whisper): läuft vollständig offline auf diesem PC und ist sehr genau. Das Modell wird einmalig geladen.</w:t>
+        <w:t xml:space="preserve">Markieren: „markiere [Wort]“, „markiere alles“, „markiere von … bis …“, „markiere den letzten Satz“.</w:t>
       </w:r>
       <w:r>
         <w:rPr>
@@ -2886,21 +2811,13 @@
     </w:p>
     <w:p>
       <w:pPr>
-        <w:pStyle w:val="Heading2"/>
-      </w:pPr>
-      <w:r>
-        <w:t xml:space="preserve">So diktieren Sie</w:t>
-      </w:r>
-    </w:p>
-    <w:p>
-      <w:pPr>
         <w:pStyle w:val="ListBullet"/>
       </w:pPr>
       <w:r>
         <w:rPr>
           <w:b/>
         </w:rPr>
-        <w:t xml:space="preserve">Diktier-Taste (Hotkey) drücken, sprechen und die Taste erneut drücken. Der erkannte Text erscheint im Diktierfenster.</w:t>
+        <w:t xml:space="preserve">Löschen: „lösche [Wort]“, „lösche das“, „lösche alles“.</w:t>
       </w:r>
       <w:r>
         <w:rPr>
@@ -2917,7 +2834,7 @@
         <w:rPr>
           <w:b/>
         </w:rPr>
-        <w:t xml:space="preserve">Ziel-App wählen: Klicken Sie auf „Ziel-App wählen“ und dann in die Anwendung, in die der Text eingefügt werden soll. WithEase merkt sich diese App; das Diktierfenster kommt anschließend automatisch wieder in den Vordergrund, weil dort Ihr nächster Schritt ist.</w:t>
+        <w:t xml:space="preserve">Zeichensetzung: „Punkt“, „Komma“, „Fragezeichen“, „Doppelpunkt“, „Klammer auf/zu“, „Anführungszeichen oben/unten“.</w:t>
       </w:r>
       <w:r>
         <w:rPr>
@@ -2934,7 +2851,7 @@
         <w:rPr>
           <w:b/>
         </w:rPr>
-        <w:t xml:space="preserve">„Einfügen“ überträgt den Text in die gemerkte Ziel-App, „Kopieren“ legt ihn in die Zwischenablage.</w:t>
+        <w:t xml:space="preserve">Weiteres: „neue Zeile“, „neuer Absatz“, „großschreiben“, „kleinschreiben“, „rückgängig“, „einfügen“, „kopieren“, „schließen“.</w:t>
       </w:r>
       <w:r>
         <w:rPr>
@@ -2948,7 +2865,20 @@
         <w:pStyle w:val="Heading2"/>
       </w:pPr>
       <w:r>
-        <w:t xml:space="preserve">Lokale Erkennung</w:t>
+        <w:t xml:space="preserve">Das Wörterbuch</w:t>
+      </w:r>
+    </w:p>
+    <w:p>
+      <w:r>
+        <w:t>Im Wörterbuch hinterlegst du eigene Wörter: Namen und Fachbegriffe verbessern die Erkennung, und du kannst optional angeben, wie ein Wort ausgesprochen wird („wenn ich X sage, schreibe Y“).</w:t>
+      </w:r>
+    </w:p>
+    <w:p>
+      <w:pPr>
+        <w:pStyle w:val="ListBullet"/>
+      </w:pPr>
+      <w:r>
+        <w:t>Suchen &amp; Hinzufügen: Tippe links ein Wort – die Liste filtert sofort, sodass du siehst, ob es bereits existiert. Rechts optional die gesprochene Form.</w:t>
       </w:r>
     </w:p>
     <w:p>
@@ -2959,7 +2889,7 @@
         <w:rPr>
           <w:b/>
         </w:rPr>
-        <w:t xml:space="preserve">Whisper-Modell: „small“ ist schnell, „medium“ deutlich genauer (empfohlen). „large-v3“ nur mit einer starken Grafikkarte.</w:t>
+        <w:t xml:space="preserve">Bearbeiten: Doppelklick auf eine Zelle. Die Herkunft jedes Eintrags (von mir, gelernt, importiert, korrigiert) steht rechts; unten lässt sich danach filtern.</w:t>
       </w:r>
       <w:r>
         <w:rPr>
@@ -2969,11 +2899,117 @@
       </w:r>
     </w:p>
     <w:p>
+      <w:pPr>
+        <w:pStyle w:val="ListBullet"/>
+      </w:pPr>
+      <w:r>
+        <w:t>Aus Text lernen: Füg einen Text ein – WithEase schlägt Fachbegriffe und Namen vor. Nur angehakte Einträge werden übernommen (gewöhnliche Wörter sind bewusst nicht vorausgewählt).</w:t>
+      </w:r>
+    </w:p>
+    <w:p>
+      <w:pPr>
+        <w:pStyle w:val="ListBullet"/>
+      </w:pPr>
+      <w:r>
+        <w:t>Export/Import: Sichere dein Wörterbuch als Textdatei oder spiel eine ein. „Kategorie leeren“ entfernt alle angezeigten Einträge auf einmal.</w:t>
+      </w:r>
+    </w:p>
+    <w:p>
+      <w:pPr>
+        <w:pStyle w:val="Heading2"/>
+      </w:pPr>
+      <w:r>
+        <w:t>KI-Funktionen (optional)</w:t>
+      </w:r>
+    </w:p>
+    <w:p>
+      <w:pPr/>
+      <w:r>
+        <w:t>Auf Wunsch hilft dir eine KI beim Aufbereiten des diktierten Textes. Dafür wird entweder ein lokaler KI-Dienst (Ollama) auf diesem PC oder ein Cloud-Zugang benötigt. Ohne KI funktioniert das Diktieren ganz normal weiter.</w:t>
+      </w:r>
+    </w:p>
+    <w:p>
+      <w:pPr>
+        <w:pStyle w:val="ListBullet"/>
+      </w:pPr>
+      <w:r>
+        <w:t>KI-Aktionen: Frei belegbare Schaltflächen am linken Rand des Diktierfensters – jede mit einem eigenen Auftrag (z. B. „Als E-Mail formulieren“ oder „In Stichpunkte“). Ein Klick wendet den Auftrag auf den aktuellen Text an. Reihenfolge und Text bearbeitest du über „KI-Aktionen“ in den Einstellungen (oder per Rechtsklick auf einen Button).</w:t>
+      </w:r>
+    </w:p>
+    <w:p>
+      <w:pPr>
+        <w:pStyle w:val="ListBullet"/>
+      </w:pPr>
+      <w:r>
+        <w:t>KI-Vorschau: Nach einer KI-Aktion siehst du das Ergebnis mit farblich hervorgehobenen Änderungen und übernimmst es erst nach deiner Bestätigung – dein Originaltext geht also nie ungefragt verloren.</w:t>
+      </w:r>
+    </w:p>
+    <w:p>
+      <w:pPr>
+        <w:pStyle w:val="ListBullet"/>
+      </w:pPr>
+      <w:r>
+        <w:t>KI-Nachbearbeitung: Optionale automatische Bereinigung nach jedem Diktat. Standardmäßig aus, da sie etwas Wartezeit kostet – für gelegentliches Aufräumen genügen die KI-Aktionen.</w:t>
+      </w:r>
+    </w:p>
+    <w:p>
+      <w:pPr>
+        <w:pStyle w:val="Heading2"/>
+      </w:pPr>
+      <w:r>
+        <w:t xml:space="preserve">Korrekturen richtig nutzen</w:t>
+      </w:r>
+    </w:p>
+    <w:p>
+      <w:r>
+        <w:t>Wird ein Wort falsch erkannt, hast du zwei Möglichkeiten – mit unterschiedlichem Verhalten:</w:t>
+      </w:r>
+    </w:p>
+    <w:p>
+      <w:pPr>
+        <w:pStyle w:val="ListBullet"/>
+      </w:pPr>
+      <w:r>
+        <w:rPr>
+          <w:b/>
+        </w:rPr>
+        <w:t xml:space="preserve">Manuell überschreiben (Wort markieren und neu sprechen oder tippen): Korrigiert nur diese eine Stelle und lernt nichts.</w:t>
+      </w:r>
       <w:r>
         <w:rPr>
           <w:b w:val="0"/>
         </w:rPr>
-        <w:t xml:space="preserve">Tipp: Ein gutes, nah am Mund platziertes Mikrofon (Headset) verbessert die Erkennung mit Abstand am meisten.</w:t>
+        <w:t xml:space="preserve"/>
+      </w:r>
+    </w:p>
+    <w:p>
+      <w:pPr>
+        <w:pStyle w:val="ListBullet"/>
+      </w:pPr>
+      <w:r>
+        <w:rPr>
+          <w:b/>
+        </w:rPr>
+        <w:t xml:space="preserve">„korrigiere das“ (oder „ersetze A durch B“): Korrigiert die Stelle und merkt sich den Verhörer.</w:t>
+      </w:r>
+      <w:r>
+        <w:rPr>
+          <w:b w:val="0"/>
+        </w:rPr>
+        <w:t xml:space="preserve"/>
+      </w:r>
+    </w:p>
+    <w:p>
+      <w:r>
+        <w:t>Warum „korrigiere das“ nicht verschlimmbessert: Ein einzelnes „korrigiere das“ greift nicht automatisch in künftige Diktate ein – es merkt sich den Fehler nur. Erst wenn derselbe Verhörer ein zweites Mal auftritt und du ihn erneut korrigierst, wird die Regel dauerhaft aktiv. Ersetzt wird nur das exakte Wort. Und die Funktion ist selbst-heilend: Ersetzt eine Regel einmal versehentlich ein gewolltes Wort und du korrigierst es zurück, wird die Regel wieder vergessen.</w:t>
+      </w:r>
+    </w:p>
+    <w:p>
+      <w:r>
+        <w:rPr>
+          <w:b w:val="0"/>
+        </w:rPr>
+        <w:t xml:space="preserve">Faustregel:</w:t>
       </w:r>
       <w:r>
         <w:rPr>
@@ -2990,18 +3026,65 @@
     </w:p>
     <w:p>
       <w:pPr>
-        <w:pStyle w:val="Heading2"/>
-      </w:pPr>
-      <w:r>
-        <w:t xml:space="preserve">Sprachbefehle</w:t>
-      </w:r>
-    </w:p>
-    <w:p>
+        <w:pStyle w:val="ListBullet"/>
+      </w:pPr>
+      <w:r>
+        <w:rPr>
+          <w:b/>
+        </w:rPr>
+        <w:t xml:space="preserve">Einmaliger Ausrutscher: egal – „korrigiere das“ ist sicher, oder einfach manuell überschreiben.</w:t>
+      </w:r>
       <w:r>
         <w:rPr>
           <w:b w:val="0"/>
         </w:rPr>
-        <w:t xml:space="preserve">Während des Diktats navigieren und formatieren Sie mit gesprochenen Befehlen. Tipp: Legen Sie eine zweite „Befehlstaste“ fest – dann gilt die Diktier-Taste immer als Text und die Befehlstaste immer als Befehl.</w:t>
+        <w:t xml:space="preserve"/>
+      </w:r>
+    </w:p>
+    <w:p>
+      <w:pPr>
+        <w:pStyle w:val="ListBullet"/>
+      </w:pPr>
+      <w:r>
+        <w:rPr>
+          <w:b/>
+        </w:rPr>
+        <w:t xml:space="preserve">Ein Wort kommt immer wieder falsch heraus (Name, Fachbegriff): „korrigiere das“ – ab dem zweiten Mal wird es automatisch korrigiert.</w:t>
+      </w:r>
+      <w:r>
+        <w:rPr>
+          <w:b w:val="0"/>
+        </w:rPr>
+        <w:t xml:space="preserve"/>
+      </w:r>
+    </w:p>
+    <w:p>
+      <w:pPr>
+        <w:pStyle w:val="ListBullet"/>
+      </w:pPr>
+      <w:r>
+        <w:t>Der Verhörer ist ein Wort, das du regelmäßig auch wirklich meinst: lieber manuell überschreiben.</w:t>
+      </w:r>
+    </w:p>
+    <w:p>
+      <w:pPr>
+        <w:pStyle w:val="ListBullet"/>
+      </w:pPr>
+      <w:r>
+        <w:t>Der Verhörer ist Kauderwelsch (z. B. „Kaser“ statt „Cursor“): immer „korrigiere das“ – „Kaser“ möchtest du ja nie schreiben.</w:t>
+      </w:r>
+    </w:p>
+    <w:p>
+      <w:r>
+        <w:t>Beispiel: Aus „Spalte“ wird „Spalter“. Da „Spalter“ ein echtes Wort ist und es ein Einzelfall war, überschreibst du es am besten manuell. „korrigiere das“ hebst du dir für Wörter auf, die dir wiederholt falsch herauskommen.</w:t>
+      </w:r>
+    </w:p>
+    <w:p>
+      <w:r>
+        <w:rPr>
+          <w:b w:val="0"/>
+        </w:rPr>
+        <w:t xml:space="preserve">Verwalten: Gelernte Korrekturen erscheinen im Wörterbuch unter der Kategorie „korrigiert“ und lassen sich dort jederzeit bearbeiten oder entfernen.</w:t>
       </w:r>
       <w:r>
         <w:rPr>
@@ -3018,449 +3101,20 @@
     </w:p>
     <w:p>
       <w:pPr>
-        <w:pStyle w:val="ListBullet"/>
-      </w:pPr>
-      <w:r>
-        <w:rPr>
-          <w:b/>
-        </w:rPr>
-        <w:t xml:space="preserve">Cursor setzen: „Cursor vor [Wort]“, „hinter [Wort]“, „an den Anfang“, „ans Ende“.</w:t>
-      </w:r>
-      <w:r>
-        <w:rPr>
-          <w:b w:val="0"/>
-        </w:rPr>
-        <w:t xml:space="preserve"/>
+        <w:pStyle w:val="Heading1"/>
+      </w:pPr>
+      <w:r>
+        <w:t xml:space="preserve">13. Über, Feedback &amp; Teilen</w:t>
       </w:r>
     </w:p>
     <w:p>
       <w:pPr>
-        <w:pStyle w:val="ListBullet"/>
-      </w:pPr>
-      <w:r>
-        <w:rPr>
-          <w:b/>
-        </w:rPr>
-        <w:t xml:space="preserve">Markieren: „markiere [Wort]“, „markiere alles“, „markiere von … bis …“, „markiere den letzten Satz“.</w:t>
-      </w:r>
-      <w:r>
-        <w:rPr>
-          <w:b w:val="0"/>
-        </w:rPr>
-        <w:t xml:space="preserve"/>
-      </w:r>
-    </w:p>
-    <w:p>
-      <w:pPr>
-        <w:pStyle w:val="ListBullet"/>
-      </w:pPr>
-      <w:r>
-        <w:rPr>
-          <w:b/>
-        </w:rPr>
-        <w:t xml:space="preserve">Löschen: „lösche [Wort]“, „lösche das“, „lösche alles“.</w:t>
-      </w:r>
-      <w:r>
-        <w:rPr>
-          <w:b w:val="0"/>
-        </w:rPr>
-        <w:t xml:space="preserve"/>
-      </w:r>
-    </w:p>
-    <w:p>
-      <w:pPr>
-        <w:pStyle w:val="ListBullet"/>
-      </w:pPr>
-      <w:r>
-        <w:rPr>
-          <w:b/>
-        </w:rPr>
-        <w:t xml:space="preserve">Zeichensetzung: „Punkt“, „Komma“, „Fragezeichen“, „Doppelpunkt“, „Klammer auf/zu“, „Anführungszeichen oben/unten“.</w:t>
-      </w:r>
-      <w:r>
-        <w:rPr>
-          <w:b w:val="0"/>
-        </w:rPr>
-        <w:t xml:space="preserve"/>
-      </w:r>
-    </w:p>
-    <w:p>
-      <w:pPr>
-        <w:pStyle w:val="ListBullet"/>
-      </w:pPr>
-      <w:r>
-        <w:rPr>
-          <w:b/>
-        </w:rPr>
-        <w:t xml:space="preserve">Weiteres: „neue Zeile“, „neuer Absatz“, „großschreiben“, „kleinschreiben“, „rückgängig“, „einfügen“, „kopieren“, „schließen“.</w:t>
-      </w:r>
-      <w:r>
-        <w:rPr>
-          <w:b w:val="0"/>
-        </w:rPr>
-        <w:t xml:space="preserve"/>
-      </w:r>
-    </w:p>
-    <w:p>
-      <w:pPr>
-        <w:pStyle w:val="Heading2"/>
-      </w:pPr>
-      <w:r>
-        <w:t xml:space="preserve">Das Wörterbuch</w:t>
-      </w:r>
-    </w:p>
-    <w:p>
-      <w:r>
-        <w:rPr>
-          <w:b w:val="0"/>
-        </w:rPr>
-        <w:t xml:space="preserve">Im Wörterbuch hinterlegen Sie eigene Wörter: Namen und Fachbegriffe verbessern die Erkennung, und Sie können optional angeben, wie ein Wort ausgesprochen wird („wenn ich X sage, schreibe Y“).</w:t>
-      </w:r>
-      <w:r>
-        <w:rPr>
-          <w:b/>
-        </w:rPr>
-        <w:t/>
-      </w:r>
-      <w:r>
-        <w:rPr>
-          <w:b w:val="0"/>
-        </w:rPr>
-        <w:t xml:space="preserve"/>
-      </w:r>
-    </w:p>
-    <w:p>
-      <w:pPr>
-        <w:pStyle w:val="ListBullet"/>
-      </w:pPr>
-      <w:r>
-        <w:rPr>
-          <w:b/>
-        </w:rPr>
-        <w:t xml:space="preserve">Suchen &amp; Hinzufügen: Tippen Sie links ein Wort – die Liste filtert sofort, sodass Sie sehen, ob es bereits existiert. Rechts optional die gesprochene Form.</w:t>
-      </w:r>
-      <w:r>
-        <w:rPr>
-          <w:b w:val="0"/>
-        </w:rPr>
-        <w:t xml:space="preserve"/>
-      </w:r>
-    </w:p>
-    <w:p>
-      <w:pPr>
-        <w:pStyle w:val="ListBullet"/>
-      </w:pPr>
-      <w:r>
-        <w:rPr>
-          <w:b/>
-        </w:rPr>
-        <w:t xml:space="preserve">Bearbeiten: Doppelklick auf eine Zelle. Die Herkunft jedes Eintrags (von mir, gelernt, importiert, korrigiert) steht rechts; unten lässt sich danach filtern.</w:t>
-      </w:r>
-      <w:r>
-        <w:rPr>
-          <w:b w:val="0"/>
-        </w:rPr>
-        <w:t xml:space="preserve"/>
-      </w:r>
-    </w:p>
-    <w:p>
-      <w:pPr>
-        <w:pStyle w:val="ListBullet"/>
-      </w:pPr>
-      <w:r>
-        <w:rPr>
-          <w:b/>
-        </w:rPr>
-        <w:t xml:space="preserve">Aus Text lernen: Fügen Sie einen Text ein – WithEase schlägt Fachbegriffe und Namen vor. Nur angehakte Einträge werden übernommen (gewöhnliche Wörter sind bewusst nicht vorausgewählt).</w:t>
-      </w:r>
-      <w:r>
-        <w:rPr>
-          <w:b w:val="0"/>
-        </w:rPr>
-        <w:t xml:space="preserve"/>
-      </w:r>
-    </w:p>
-    <w:p>
-      <w:pPr>
-        <w:pStyle w:val="ListBullet"/>
-      </w:pPr>
-      <w:r>
-        <w:rPr>
-          <w:b/>
-        </w:rPr>
-        <w:t xml:space="preserve">Export/Import: Sichern Sie Ihr Wörterbuch als Textdatei oder spielen Sie eine ein. „Kategorie leeren“ entfernt alle angezeigten Einträge auf einmal.</w:t>
-      </w:r>
-      <w:r>
-        <w:rPr>
-          <w:b w:val="0"/>
-        </w:rPr>
-        <w:t xml:space="preserve"/>
-      </w:r>
-    </w:p>
-    <w:p>
-      <w:pPr>
-        <w:pStyle w:val="Heading2"/>
-      </w:pPr>
-      <w:r>
-        <w:t>KI-Funktionen (optional)</w:t>
-      </w:r>
-    </w:p>
-    <w:p>
-      <w:pPr/>
-      <w:r>
-        <w:t>Auf Wunsch hilft Ihnen eine KI beim Aufbereiten des diktierten Textes. Dafür wird entweder ein lokaler KI-Dienst (Ollama) auf diesem PC oder ein Cloud-Zugang benötigt. Ohne KI funktioniert das Diktieren ganz normal weiter.</w:t>
-      </w:r>
-    </w:p>
-    <w:p>
-      <w:pPr>
-        <w:pStyle w:val="ListBullet"/>
-      </w:pPr>
-      <w:r>
-        <w:t>KI-Aktionen: Frei belegbare Schaltflächen am linken Rand des Diktierfensters – jede mit einem eigenen Auftrag (z. B. „Als E-Mail formulieren“ oder „In Stichpunkte“). Ein Klick wendet den Auftrag auf den aktuellen Text an. Reihenfolge und Text bearbeiten Sie über „KI-Aktionen“ in den Einstellungen (oder per Rechtsklick auf einen Button).</w:t>
-      </w:r>
-    </w:p>
-    <w:p>
-      <w:pPr>
-        <w:pStyle w:val="ListBullet"/>
-      </w:pPr>
-      <w:r>
-        <w:t>KI-Vorschau: Nach einer KI-Aktion sehen Sie das Ergebnis mit farblich hervorgehobenen Änderungen und übernehmen es erst nach Ihrer Bestätigung – Ihr Originaltext geht also nie ungefragt verloren.</w:t>
-      </w:r>
-    </w:p>
-    <w:p>
-      <w:pPr>
-        <w:pStyle w:val="ListBullet"/>
-      </w:pPr>
-      <w:r>
-        <w:t>KI-Nachbearbeitung: Optionale automatische Bereinigung nach jedem Diktat. Standardmäßig aus, da sie etwas Wartezeit kostet – für gelegentliches Aufräumen genügen die KI-Aktionen.</w:t>
-      </w:r>
-    </w:p>
-    <w:p>
-      <w:pPr>
-        <w:pStyle w:val="Heading2"/>
-      </w:pPr>
-      <w:r>
-        <w:t xml:space="preserve">Korrekturen richtig nutzen</w:t>
-      </w:r>
-    </w:p>
-    <w:p>
-      <w:r>
-        <w:rPr>
-          <w:b w:val="0"/>
-        </w:rPr>
-        <w:t xml:space="preserve">Wird ein Wort falsch erkannt, haben Sie zwei Möglichkeiten – mit unterschiedlichem Verhalten:</w:t>
-      </w:r>
-      <w:r>
-        <w:rPr>
-          <w:b/>
-        </w:rPr>
-        <w:t/>
-      </w:r>
-      <w:r>
-        <w:rPr>
-          <w:b w:val="0"/>
-        </w:rPr>
-        <w:t xml:space="preserve"/>
-      </w:r>
-    </w:p>
-    <w:p>
-      <w:pPr>
-        <w:pStyle w:val="ListBullet"/>
-      </w:pPr>
-      <w:r>
-        <w:rPr>
-          <w:b/>
-        </w:rPr>
-        <w:t xml:space="preserve">Manuell überschreiben (Wort markieren und neu sprechen oder tippen): Korrigiert nur diese eine Stelle und lernt nichts.</w:t>
-      </w:r>
-      <w:r>
-        <w:rPr>
-          <w:b w:val="0"/>
-        </w:rPr>
-        <w:t xml:space="preserve"/>
-      </w:r>
-    </w:p>
-    <w:p>
-      <w:pPr>
-        <w:pStyle w:val="ListBullet"/>
-      </w:pPr>
-      <w:r>
-        <w:rPr>
-          <w:b/>
-        </w:rPr>
-        <w:t xml:space="preserve">„korrigiere das“ (oder „ersetze A durch B“): Korrigiert die Stelle und merkt sich den Verhörer.</w:t>
-      </w:r>
-      <w:r>
-        <w:rPr>
-          <w:b w:val="0"/>
-        </w:rPr>
-        <w:t xml:space="preserve"/>
-      </w:r>
-    </w:p>
-    <w:p>
-      <w:r>
-        <w:rPr>
-          <w:b w:val="0"/>
-        </w:rPr>
-        <w:t xml:space="preserve">Warum „korrigiere das“ nicht verschlimmbessert: Ein einzelnes „korrigiere das“ greift nicht automatisch in künftige Diktate ein – es merkt sich den Fehler nur. Erst wenn derselbe Verhörer ein zweites Mal auftritt und Sie ihn erneut korrigieren, wird die Regel dauerhaft aktiv. Ersetzt wird nur das exakte Wort. Und die Funktion ist selbst-heilend: Ersetzt eine Regel einmal versehentlich ein gewolltes Wort und Sie korrigieren es zurück, wird die Regel wieder vergessen.</w:t>
-      </w:r>
-      <w:r>
-        <w:rPr>
-          <w:b/>
-        </w:rPr>
-        <w:t/>
-      </w:r>
-      <w:r>
-        <w:rPr>
-          <w:b w:val="0"/>
-        </w:rPr>
-        <w:t xml:space="preserve"/>
-      </w:r>
-    </w:p>
-    <w:p>
-      <w:r>
-        <w:rPr>
-          <w:b w:val="0"/>
-        </w:rPr>
-        <w:t xml:space="preserve">Faustregel:</w:t>
-      </w:r>
-      <w:r>
-        <w:rPr>
-          <w:b/>
-        </w:rPr>
-        <w:t/>
-      </w:r>
-      <w:r>
-        <w:rPr>
-          <w:b w:val="0"/>
-        </w:rPr>
-        <w:t xml:space="preserve"/>
-      </w:r>
-    </w:p>
-    <w:p>
-      <w:pPr>
-        <w:pStyle w:val="ListBullet"/>
-      </w:pPr>
-      <w:r>
-        <w:rPr>
-          <w:b/>
-        </w:rPr>
-        <w:t xml:space="preserve">Einmaliger Ausrutscher: egal – „korrigiere das“ ist sicher, oder einfach manuell überschreiben.</w:t>
-      </w:r>
-      <w:r>
-        <w:rPr>
-          <w:b w:val="0"/>
-        </w:rPr>
-        <w:t xml:space="preserve"/>
-      </w:r>
-    </w:p>
-    <w:p>
-      <w:pPr>
-        <w:pStyle w:val="ListBullet"/>
-      </w:pPr>
-      <w:r>
-        <w:rPr>
-          <w:b/>
-        </w:rPr>
-        <w:t xml:space="preserve">Ein Wort kommt immer wieder falsch heraus (Name, Fachbegriff): „korrigiere das“ – ab dem zweiten Mal wird es automatisch korrigiert.</w:t>
-      </w:r>
-      <w:r>
-        <w:rPr>
-          <w:b w:val="0"/>
-        </w:rPr>
-        <w:t xml:space="preserve"/>
-      </w:r>
-    </w:p>
-    <w:p>
-      <w:pPr>
-        <w:pStyle w:val="ListBullet"/>
-      </w:pPr>
-      <w:r>
-        <w:rPr>
-          <w:b/>
-        </w:rPr>
-        <w:t xml:space="preserve">Der Verhörer ist ein Wort, das Sie regelmäßig auch wirklich meinen: lieber manuell überschreiben.</w:t>
-      </w:r>
-      <w:r>
-        <w:rPr>
-          <w:b w:val="0"/>
-        </w:rPr>
-        <w:t xml:space="preserve"/>
-      </w:r>
-    </w:p>
-    <w:p>
-      <w:pPr>
-        <w:pStyle w:val="ListBullet"/>
-      </w:pPr>
-      <w:r>
-        <w:rPr>
-          <w:b/>
-        </w:rPr>
-        <w:t xml:space="preserve">Der Verhörer ist Kauderwelsch (z. B. „Kaser“ statt „Cursor“): immer „korrigiere das“ – „Kaser“ möchten Sie ja nie schreiben.</w:t>
-      </w:r>
-      <w:r>
-        <w:rPr>
-          <w:b w:val="0"/>
-        </w:rPr>
-        <w:t xml:space="preserve"/>
-      </w:r>
-    </w:p>
-    <w:p>
-      <w:r>
-        <w:rPr>
-          <w:b w:val="0"/>
-        </w:rPr>
-        <w:t xml:space="preserve">Beispiel: Aus „Spalte“ wird „Spalter“. Da „Spalter“ ein echtes Wort ist und es ein Einzelfall war, überschreiben Sie es am besten manuell. „korrigiere das“ heben Sie sich für Wörter auf, die Ihnen wiederholt falsch herauskommen.</w:t>
-      </w:r>
-      <w:r>
-        <w:rPr>
-          <w:b/>
-        </w:rPr>
-        <w:t/>
-      </w:r>
-      <w:r>
-        <w:rPr>
-          <w:b w:val="0"/>
-        </w:rPr>
-        <w:t xml:space="preserve"/>
-      </w:r>
-    </w:p>
-    <w:p>
-      <w:r>
-        <w:rPr>
-          <w:b w:val="0"/>
-        </w:rPr>
-        <w:t xml:space="preserve">Verwalten: Gelernte Korrekturen erscheinen im Wörterbuch unter der Kategorie „korrigiert“ und lassen sich dort jederzeit bearbeiten oder entfernen.</w:t>
-      </w:r>
-      <w:r>
-        <w:rPr>
-          <w:b/>
-        </w:rPr>
-        <w:t/>
-      </w:r>
-      <w:r>
-        <w:rPr>
-          <w:b w:val="0"/>
-        </w:rPr>
-        <w:t xml:space="preserve"/>
-      </w:r>
-    </w:p>
-    <w:p>
-      <w:pPr>
-        <w:pStyle w:val="Heading1"/>
-      </w:pPr>
-      <w:r>
-        <w:t xml:space="preserve">13. Über, Feedback &amp; Teilen</w:t>
-      </w:r>
-    </w:p>
-    <w:p>
-      <w:pPr>
         <w:jc w:val="center"/>
       </w:pPr>
       <w:r>
         <w:drawing>
           <wp:inline xmlns:a="http://schemas.openxmlformats.org/drawingml/2006/main" xmlns:pic="http://schemas.openxmlformats.org/drawingml/2006/picture">
-            <wp:extent cx="5580000" cy="3065294"/>
+            <wp:extent cx="5580000" cy="4546666"/>
             <wp:docPr id="10" name="Picture 10"/>
             <wp:cNvGraphicFramePr>
               <a:graphicFrameLocks noChangeAspect="1"/>
@@ -3481,7 +3135,7 @@
                   <pic:spPr>
                     <a:xfrm>
                       <a:off x="0" y="0"/>
-                      <a:ext cx="5580000" cy="3065294"/>
+                      <a:ext cx="5580000" cy="4546666"/>
                     </a:xfrm>
                     <a:prstGeom prst="rect"/>
                   </pic:spPr>
@@ -3516,10 +3170,7 @@
         <w:t>Feedback senden:</w:t>
       </w:r>
       <w:r>
-        <w:rPr>
-          <w:b w:val="0"/>
-        </w:rPr>
-        <w:t xml:space="preserve"> Schreiben Sie direkt aus dem Programm heraus – kein E-Mail-Programm nötig. Version und Betriebssystem werden automatisch mitgeschickt.</w:t>
+        <w:t xml:space="preserve"> Schreib direkt aus dem Programm heraus – kein E-Mail-Programm nötig. Version und Betriebssystem werden automatisch mitgeschickt.</w:t>
       </w:r>
     </w:p>
     <w:p>
@@ -3557,32 +3208,43 @@
       </w:r>
     </w:p>
     <w:p>
-      <w:r>
-        <w:br w:type="page"/>
+      <w:pPr>
+        <w:pStyle w:val="ListBullet"/>
+      </w:pPr>
+      <w:r>
+        <w:rPr>
+          <w:b/>
+        </w:rPr>
+        <w:t xml:space="preserve">Unterstützen (Ko-fi): </w:t>
+      </w:r>
+      <w:r>
+        <w:t>WithEase ist und bleibt kostenlos. Wenn dir das Programm gefällt und dich im Alltag unterstützt, kannst du meine Arbeit über einen kleinen, freiwilligen Beitrag auf Ko-fi unterstützen – ganz ohne Zwang.</w:t>
       </w:r>
     </w:p>
     <w:p>
-      <w:pPr>
-        <w:pStyle w:val="Heading1"/>
-      </w:pPr>
-      <w:r>
-        <w:t xml:space="preserve">14. Tipps &amp; Problemlösung</w:t>
+      <w:r>
+        <w:br w:type="page"/>
       </w:r>
     </w:p>
     <w:p>
       <w:pPr>
-        <w:pStyle w:val="Heading2"/>
-      </w:pPr>
-      <w:r>
-        <w:t>Eine Taste hängt oder alles verhält sich seltsam</w:t>
+        <w:pStyle w:val="Heading1"/>
+      </w:pPr>
+      <w:r>
+        <w:t xml:space="preserve">14. Tipps &amp; Problemlösung</w:t>
       </w:r>
     </w:p>
     <w:p>
-      <w:r>
-        <w:rPr>
-          <w:b w:val="0"/>
-        </w:rPr>
-        <w:t xml:space="preserve">Drücken Sie die </w:t>
+      <w:pPr>
+        <w:pStyle w:val="Heading2"/>
+      </w:pPr>
+      <w:r>
+        <w:t>Eine Taste hängt oder alles verhält sich seltsam</w:t>
+      </w:r>
+    </w:p>
+    <w:p>
+      <w:r>
+        <w:t xml:space="preserve">Drück die </w:t>
       </w:r>
       <w:r>
         <w:rPr>
@@ -3591,10 +3253,7 @@
         <w:t>Notfall-Stop-Taste</w:t>
       </w:r>
       <w:r>
-        <w:rPr>
-          <w:b w:val="0"/>
-        </w:rPr>
-        <w:t xml:space="preserve"> (Standard F12). Sie gibt hängende Tasten frei und schaltet alle Hilfen ab. Erneut drücken schaltet sie wieder ein.</w:t>
+        <w:t xml:space="preserve"> (Standard F12) – sie gibt hängende Tasten frei und schaltet alle Hilfen ab. Erneut drücken schaltet sie wieder ein.</w:t>
       </w:r>
     </w:p>
     <w:p>
@@ -3647,10 +3306,7 @@
     </w:p>
     <w:p>
       <w:r>
-        <w:rPr>
-          <w:b w:val="0"/>
-        </w:rPr>
-        <w:t>Klicken Sie unten rechts auf den kleinen Pfeil „^“. In den Windows-Einstellungen können Sie das Symbol dauerhaft einblenden.</w:t>
+        <w:t>Klick unten rechts auf den kleinen Pfeil „^“. In den Windows-Einstellungen kannst du das Symbol dauerhaft einblenden.</w:t>
       </w:r>
     </w:p>
     <w:p>
@@ -3663,10 +3319,7 @@
     </w:p>
     <w:p>
       <w:r>
-        <w:rPr>
-          <w:b w:val="0"/>
-        </w:rPr>
-        <w:t xml:space="preserve">Prüfen Sie, ob das Eingabefeld </w:t>
+        <w:t xml:space="preserve">Prüf, ob das Eingabefeld </w:t>
       </w:r>
       <w:r>
         <w:rPr>
@@ -3675,9 +3328,6 @@
         <w:t>Einfügen (Strg+V)</w:t>
       </w:r>
       <w:r>
-        <w:rPr>
-          <w:b w:val="0"/>
-        </w:rPr>
         <w:t xml:space="preserve"> erlaubt. In seltenen Fällen hilft es, das Makro erneut auszulösen.</w:t>
       </w:r>
     </w:p>
@@ -3691,10 +3341,7 @@
     </w:p>
     <w:p>
       <w:r>
-        <w:rPr>
-          <w:b w:val="0"/>
-        </w:rPr>
-        <w:t xml:space="preserve">Setzen Sie in </w:t>
+        <w:t xml:space="preserve">Setz in </w:t>
       </w:r>
       <w:r>
         <w:rPr>
@@ -3703,9 +3350,6 @@
         <w:t>Tastatur → Sticky Keys</w:t>
       </w:r>
       <w:r>
-        <w:rPr>
-          <w:b w:val="0"/>
-        </w:rPr>
         <w:t xml:space="preserve"> das Häkchen bei </w:t>
       </w:r>
       <w:r>
@@ -3715,54 +3359,20 @@
         <w:t>Sticky AltGr</w:t>
       </w:r>
       <w:r>
-        <w:rPr>
-          <w:b w:val="0"/>
-        </w:rPr>
         <w:t xml:space="preserve"> – jeder Modifier wird einzeln aktiviert.</w:t>
       </w:r>
     </w:p>
     <w:p>
       <w:pPr>
-        <w:pStyle w:val="Heading2"/>
-      </w:pPr>
-      <w:r>
-        <w:t>Linux: Tasten werden nicht erkannt</w:t>
+        <w:pStyle w:val="Heading1"/>
+      </w:pPr>
+      <w:r>
+        <w:t xml:space="preserve">15. Hilfe &amp; Kontakt</w:t>
       </w:r>
     </w:p>
     <w:p>
       <w:r>
-        <w:rPr>
-          <w:b w:val="0"/>
-        </w:rPr>
-        <w:t xml:space="preserve">Nutzen Sie eine </w:t>
-      </w:r>
-      <w:r>
-        <w:rPr>
-          <w:b/>
-        </w:rPr>
-        <w:t>X11/Xorg</w:t>
-      </w:r>
-      <w:r>
-        <w:rPr>
-          <w:b w:val="0"/>
-        </w:rPr>
-        <w:t>-Sitzung. Unter Wayland sperrt das System die globale Tastaturerkennung.</w:t>
-      </w:r>
-    </w:p>
-    <w:p>
-      <w:pPr>
-        <w:pStyle w:val="Heading1"/>
-      </w:pPr>
-      <w:r>
-        <w:t xml:space="preserve">15. Hilfe &amp; Kontakt</w:t>
-      </w:r>
-    </w:p>
-    <w:p>
-      <w:r>
-        <w:rPr>
-          <w:b w:val="0"/>
-        </w:rPr>
-        <w:t>Sie haben einen Fehler gefunden, einen Wunsch oder eine Frage? Rückmeldungen sind ausdrücklich erwünscht – sie machen WithEase besser.</w:t>
+        <w:t>Du hast einen Fehler gefunden, einen Wunsch oder eine Frage? Rückmeldungen sind ausdrücklich erwünscht – sie machen WithEase besser.</w:t>
       </w:r>
     </w:p>
     <w:p>

</xml_diff>

<commit_message>
docs(manual): finish du-form — convert text-box callouts + heading
The earlier du-form pass used python-docx, which does not iterate text boxes
(<w:txbxContent>), so the callout/tip boxes and the "So diktieren Sie" heading
stayed in the formal Sie form. Convert them at the run level in the raw XML so
the manual is now consistently informal du (only the legit "Sie wird ..."
pronoun for die Linux-Version remains).

Co-Authored-By: Claude Opus 4.8 <noreply@anthropic.com>
</commit_message>
<xml_diff>
--- a/docs/WithEase-Anleitung.docx
+++ b/docs/WithEase-Anleitung.docx
@@ -423,7 +423,7 @@
               <w:rPr>
                 <w:b w:val="0"/>
               </w:rPr>
-              <w:t>WithEase ist kostenlos, benötigt kein Benutzerkonto, zeigt keine Werbung und sendet Ihre Eingaben nirgendwohin. Alle Einstellungen bleiben auf Ihrem PC.</w:t>
+              <w:t>WithEase ist kostenlos, benötigt kein Benutzerkonto, zeigt keine Werbung und sendet deine Eingaben nirgendwohin. Alle Einstellungen bleiben auf deinem PC.</w:t>
             </w:r>
           </w:p>
         </w:tc>
@@ -590,7 +590,7 @@
               <w:rPr>
                 <w:b w:val="0"/>
               </w:rPr>
-              <w:t xml:space="preserve">Diese Meldung erscheint, weil das Programm nicht kostenpflichtig signiert ist – nicht, weil etwas damit nicht stimmt. Klicken Sie auf </w:t>
+              <w:t xml:space="preserve">Diese Meldung erscheint, weil das Programm nicht kostenpflichtig signiert ist – nicht, weil etwas damit nicht stimmt. Klick auf </w:t>
             </w:r>
             <w:r>
               <w:rPr>
@@ -614,7 +614,7 @@
               <w:rPr>
                 <w:b w:val="0"/>
               </w:rPr>
-              <w:t xml:space="preserve">. Tipp: Wenn Sie die ZIP-Datei vor dem Entpacken per Rechtsklick → Eigenschaften → </w:t>
+              <w:t xml:space="preserve">. Tipp: Wenn du die ZIP-Datei vor dem Entpacken per Rechtsklick → Eigenschaften → </w:t>
             </w:r>
             <w:r>
               <w:rPr>
@@ -626,7 +626,7 @@
               <w:rPr>
                 <w:b w:val="0"/>
               </w:rPr>
-              <w:t xml:space="preserve"> freigeben, erscheint die Warnung gar nicht erst.</w:t>
+              <w:t xml:space="preserve"> freigibst, erscheint die Warnung gar nicht erst.</w:t>
             </w:r>
           </w:p>
         </w:tc>
@@ -883,7 +883,7 @@
               <w:rPr>
                 <w:b w:val="0"/>
               </w:rPr>
-              <w:t>Sie müssen nichts bestätigen – jede Änderung wird automatisch im aktiven Profil gesichert.</w:t>
+              <w:t>Du musst nichts bestätigen – jede Änderung wird automatisch im aktiven Profil gesichert.</w:t>
             </w:r>
           </w:p>
         </w:tc>
@@ -1053,7 +1053,7 @@
               <w:rPr>
                 <w:b w:val="0"/>
               </w:rPr>
-              <w:t xml:space="preserve">Weisen Sie unbedingt eine </w:t>
+              <w:t xml:space="preserve">Weise unbedingt eine </w:t>
             </w:r>
             <w:r>
               <w:rPr>
@@ -1065,7 +1065,7 @@
               <w:rPr>
                 <w:b w:val="0"/>
               </w:rPr>
-              <w:t xml:space="preserve"> zu (z. B. F12). Ohne sie bleibt Ihnen im Notfall nur das Tray-Menü.</w:t>
+              <w:t xml:space="preserve"> zu (z. B. F12). Ohne sie bleibt dir im Notfall nur das Tray-Menü.</w:t>
             </w:r>
           </w:p>
         </w:tc>
@@ -1764,7 +1764,7 @@
               <w:rPr>
                 <w:b w:val="0"/>
               </w:rPr>
-              <w:t xml:space="preserve">Aktivieren Sie </w:t>
+              <w:t xml:space="preserve">Aktiviere </w:t>
             </w:r>
             <w:r>
               <w:rPr>
@@ -1776,7 +1776,7 @@
               <w:rPr>
                 <w:b w:val="0"/>
               </w:rPr>
-              <w:t>, dann sehen Sie am Bildschirmrand jederzeit, welche Tasten gerade vorgemerkt sind. Position und Größe sind einstellbar.</w:t>
+              <w:t>, dann siehst du am Bildschirmrand jederzeit, welche Tasten gerade vorgemerkt sind. Position und Größe sind einstellbar.</w:t>
             </w:r>
           </w:p>
         </w:tc>
@@ -2104,7 +2104,7 @@
               <w:rPr>
                 <w:b w:val="0"/>
               </w:rPr>
-              <w:t xml:space="preserve"> eingefügt (wie Strg+V). Das ist zuverlässig und behält Umlaute und Zeilenumbrüche bei. Ihre vorherige Zwischenablage wird danach wiederhergestellt. In Chat-Feldern kann ein Zeilenumbruch die Nachricht absenden – dort besser einzeilige Bausteine nutzen.</w:t>
+              <w:t xml:space="preserve"> eingefügt (wie Strg+V). Das ist zuverlässig und behält Umlaute und Zeilenumbrüche bei. Deine vorherige Zwischenablage wird danach wiederhergestellt. In Chat-Feldern kann ein Zeilenumbruch die Nachricht absenden – dort besser einzeilige Bausteine nutzen.</w:t>
             </w:r>
           </w:p>
         </w:tc>
@@ -2672,7 +2672,7 @@
         <w:pStyle w:val="Heading2"/>
       </w:pPr>
       <w:r>
-        <w:t xml:space="preserve">So diktieren Sie</w:t>
+        <w:t xml:space="preserve">So diktierst du</w:t>
       </w:r>
     </w:p>
     <w:p>
@@ -3452,7 +3452,7 @@
               <w:rPr>
                 <w:b w:val="0"/>
               </w:rPr>
-              <w:t>Egal ob Fehler, Wunsch oder eine Idee, die Ihnen den Alltag erleichtern würde – schreiben Sie mir gern. WithEase lebt davon, dass Betroffene sagen, was sie wirklich brauchen.</w:t>
+              <w:t>Egal ob Fehler, Wunsch oder eine Idee, die dir den Alltag erleichtern würde – schreib mir gern. WithEase lebt davon, dass Betroffene sagen, was sie wirklich brauchen.</w:t>
             </w:r>
           </w:p>
         </w:tc>

</xml_diff>

<commit_message>
docs(manual): refresh German screenshots to the 0.3.0 UI + regenerate PDF
Render the German settings pages/dialog from the current app (matching the
English manual's style) and regenerate WithEase-Anleitung.pdf.

Co-Authored-By: Claude Opus 4.8 <noreply@anthropic.com>
</commit_message>
<xml_diff>
--- a/docs/WithEase-Anleitung.docx
+++ b/docs/WithEase-Anleitung.docx
@@ -1016,7 +1016,7 @@
         <w:rPr/>
         <w:drawing>
           <wp:inline distT="0" distB="0" distL="0" distR="0">
-            <wp:extent cx="5579745" cy="2615565"/>
+            <wp:extent cx="5579745" cy="4443130"/>
             <wp:effectExtent l="0" t="0" r="0" b="0"/>
             <wp:docPr id="2" name="Picture 2"/>
             <wp:cNvGraphicFramePr>
@@ -1040,7 +1040,7 @@
                   <pic:spPr bwMode="auto">
                     <a:xfrm>
                       <a:off x="0" y="0"/>
-                      <a:ext cx="5579745" cy="2615565"/>
+                      <a:ext cx="5579745" cy="4443130"/>
                     </a:xfrm>
                     <a:prstGeom prst="rect">
                       <a:avLst/>
@@ -1647,7 +1647,7 @@
         <w:rPr/>
         <w:drawing>
           <wp:inline distT="0" distB="0" distL="0" distR="0">
-            <wp:extent cx="5579745" cy="3382645"/>
+            <wp:extent cx="5579745" cy="4443130"/>
             <wp:effectExtent l="0" t="0" r="0" b="0"/>
             <wp:docPr id="3" name="Picture 3"/>
             <wp:cNvGraphicFramePr>
@@ -1671,7 +1671,7 @@
                   <pic:spPr bwMode="auto">
                     <a:xfrm>
                       <a:off x="0" y="0"/>
-                      <a:ext cx="5579745" cy="3382645"/>
+                      <a:ext cx="5579745" cy="4443130"/>
                     </a:xfrm>
                     <a:prstGeom prst="rect">
                       <a:avLst/>
@@ -1899,7 +1899,7 @@
         <w:rPr/>
         <w:drawing>
           <wp:inline distT="0" distB="0" distL="0" distR="0">
-            <wp:extent cx="5579745" cy="4362450"/>
+            <wp:extent cx="5579745" cy="4443130"/>
             <wp:effectExtent l="0" t="0" r="0" b="0"/>
             <wp:docPr id="4" name="Picture 4"/>
             <wp:cNvGraphicFramePr>
@@ -1923,7 +1923,7 @@
                   <pic:spPr bwMode="auto">
                     <a:xfrm>
                       <a:off x="0" y="0"/>
-                      <a:ext cx="5579745" cy="4362450"/>
+                      <a:ext cx="5579745" cy="4443130"/>
                     </a:xfrm>
                     <a:prstGeom prst="rect">
                       <a:avLst/>
@@ -2073,7 +2073,7 @@
         <w:rPr/>
         <w:drawing>
           <wp:inline distT="0" distB="0" distL="0" distR="0">
-            <wp:extent cx="5579745" cy="3435985"/>
+            <wp:extent cx="5579745" cy="4443130"/>
             <wp:effectExtent l="0" t="0" r="0" b="0"/>
             <wp:docPr id="5" name="Picture 5"/>
             <wp:cNvGraphicFramePr>
@@ -2097,7 +2097,7 @@
                   <pic:spPr bwMode="auto">
                     <a:xfrm>
                       <a:off x="0" y="0"/>
-                      <a:ext cx="5579745" cy="3435985"/>
+                      <a:ext cx="5579745" cy="4443130"/>
                     </a:xfrm>
                     <a:prstGeom prst="rect">
                       <a:avLst/>
@@ -2593,7 +2593,7 @@
         <w:rPr/>
         <w:drawing>
           <wp:inline distT="0" distB="0" distL="0" distR="0">
-            <wp:extent cx="4140200" cy="3103245"/>
+            <wp:extent cx="4140200" cy="3344007"/>
             <wp:effectExtent l="0" t="0" r="0" b="0"/>
             <wp:docPr id="6" name="Picture 6"/>
             <wp:cNvGraphicFramePr>
@@ -2617,7 +2617,7 @@
                   <pic:spPr bwMode="auto">
                     <a:xfrm>
                       <a:off x="0" y="0"/>
-                      <a:ext cx="4140200" cy="3103245"/>
+                      <a:ext cx="4140200" cy="3344007"/>
                     </a:xfrm>
                     <a:prstGeom prst="rect">
                       <a:avLst/>
@@ -2876,7 +2876,7 @@
         <w:rPr/>
         <w:drawing>
           <wp:inline distT="0" distB="0" distL="0" distR="0">
-            <wp:extent cx="5579745" cy="3112770"/>
+            <wp:extent cx="5579745" cy="4443130"/>
             <wp:effectExtent l="0" t="0" r="0" b="0"/>
             <wp:docPr id="7" name="Picture 7"/>
             <wp:cNvGraphicFramePr>
@@ -2900,7 +2900,7 @@
                   <pic:spPr bwMode="auto">
                     <a:xfrm>
                       <a:off x="0" y="0"/>
-                      <a:ext cx="5579745" cy="3112770"/>
+                      <a:ext cx="5579745" cy="4443130"/>
                     </a:xfrm>
                     <a:prstGeom prst="rect">
                       <a:avLst/>
@@ -3078,7 +3078,7 @@
         <w:rPr/>
         <w:drawing>
           <wp:inline distT="0" distB="0" distL="0" distR="0">
-            <wp:extent cx="5579745" cy="3515360"/>
+            <wp:extent cx="5579745" cy="4443130"/>
             <wp:effectExtent l="0" t="0" r="0" b="0"/>
             <wp:docPr id="8" name="Picture 8"/>
             <wp:cNvGraphicFramePr>
@@ -3102,7 +3102,7 @@
                   <pic:spPr bwMode="auto">
                     <a:xfrm>
                       <a:off x="0" y="0"/>
-                      <a:ext cx="5579745" cy="3515360"/>
+                      <a:ext cx="5579745" cy="4443130"/>
                     </a:xfrm>
                     <a:prstGeom prst="rect">
                       <a:avLst/>
@@ -3248,7 +3248,7 @@
         <w:rPr/>
         <w:drawing>
           <wp:inline distT="0" distB="0" distL="0" distR="0">
-            <wp:extent cx="5579745" cy="2652395"/>
+            <wp:extent cx="5579745" cy="4443130"/>
             <wp:effectExtent l="0" t="0" r="0" b="0"/>
             <wp:docPr id="9" name="Picture 9"/>
             <wp:cNvGraphicFramePr>
@@ -3272,7 +3272,7 @@
                   <pic:spPr bwMode="auto">
                     <a:xfrm>
                       <a:off x="0" y="0"/>
-                      <a:ext cx="5579745" cy="2652395"/>
+                      <a:ext cx="5579745" cy="4443130"/>
                     </a:xfrm>
                     <a:prstGeom prst="rect">
                       <a:avLst/>
@@ -4041,7 +4041,7 @@
         <w:rPr/>
         <w:drawing>
           <wp:inline distT="0" distB="0" distL="0" distR="0">
-            <wp:extent cx="5579745" cy="4546600"/>
+            <wp:extent cx="5579745" cy="4443130"/>
             <wp:effectExtent l="0" t="0" r="0" b="0"/>
             <wp:docPr id="10" name="Picture 10"/>
             <wp:cNvGraphicFramePr>
@@ -4065,7 +4065,7 @@
                   <pic:spPr bwMode="auto">
                     <a:xfrm>
                       <a:off x="0" y="0"/>
-                      <a:ext cx="5579745" cy="4546600"/>
+                      <a:ext cx="5579745" cy="4443130"/>
                     </a:xfrm>
                     <a:prstGeom prst="rect">
                       <a:avLst/>

</xml_diff>

<commit_message>
docs: dictation chapter for v1.2.0 — Wörterbuch/KI split, GPU setup + screenshot
- Split the "Wörterbuch & KI" overview into separate Wörterbuch and a
  "KI (zum Ausklappen anhaken)" entry (matching the new settings groups)
- Add a GPU-acceleration note under local recognition (Set up GPU acceleration)
- Add a current dictation-settings screenshot (DE + EN)
- Bump the manual version reference 0.3.0 -> 0.4.0; regenerate both PDFs

Co-Authored-By: Claude Opus 4.8 <noreply@anthropic.com>
</commit_message>
<xml_diff>
--- a/docs/WithEase-Anleitung.docx
+++ b/docs/WithEase-Anleitung.docx
@@ -115,7 +115,7 @@
           <w:color w:val="555555"/>
           <w:sz w:val="22"/>
         </w:rPr>
-        <w:t>Version 0.3.0</w:t>
+        <w:t>Version 0.4.0</w:t>
       </w:r>
     </w:p>
     <w:p>
@@ -3459,8 +3459,15 @@
         <w:rPr/>
       </w:pPr>
       <w:r>
-        <w:rPr/>
-        <w:t>Wörterbuch &amp; KI: Dein persönliches Wörterbuch sowie die optionalen KI-Funktionen.</w:t>
+        <w:t>Wörterbuch: Dein persönliches Wörterbuch für Namen und Fachbegriffe.</w:t>
+      </w:r>
+    </w:p>
+    <w:p>
+      <w:pPr>
+        <w:pStyle w:val="ListBullet"/>
+      </w:pPr>
+      <w:r>
+        <w:t>KI (zum Ausklappen anhaken): die optionalen KI-Funktionen (KI-Aktionen und KI-Nachbearbeitung) – standardmäßig zugeklappt, erst durch Anhaken sichtbar.</w:t>
       </w:r>
     </w:p>
     <w:p>
@@ -3479,6 +3486,53 @@
     </w:p>
     <w:p>
       <w:pPr>
+        <w:jc w:val="center"/>
+      </w:pPr>
+      <w:r>
+        <w:drawing>
+          <wp:inline xmlns:a="http://schemas.openxmlformats.org/drawingml/2006/main">
+            <wp:extent cx="4572000" cy="6316579"/>
+            <wp:docPr id="11" name="Picture 11"/>
+            <wp:cNvGraphicFramePr>
+              <a:graphicFrameLocks noChangeAspect="1"/>
+            </wp:cNvGraphicFramePr>
+            <a:graphic>
+              <a:graphicData uri="http://schemas.openxmlformats.org/drawingml/2006/picture">
+                <pic:pic>
+                  <pic:nvPicPr>
+                    <pic:cNvPr id="0" name="dict_de.png"/>
+                    <pic:cNvPicPr/>
+                  </pic:nvPicPr>
+                  <pic:blipFill>
+                    <a:blip r:embed="rId20"/>
+                    <a:stretch>
+                      <a:fillRect/>
+                    </a:stretch>
+                  </pic:blipFill>
+                  <pic:spPr>
+                    <a:xfrm>
+                      <a:off x="0" y="0"/>
+                      <a:ext cx="4572000" cy="6316579"/>
+                    </a:xfrm>
+                    <a:prstGeom prst="rect"/>
+                  </pic:spPr>
+                </pic:pic>
+              </a:graphicData>
+            </a:graphic>
+          </wp:inline>
+        </w:drawing>
+      </w:r>
+    </w:p>
+    <w:p>
+      <w:pPr>
+        <w:jc w:val="center"/>
+      </w:pPr>
+      <w:r>
+        <w:t>Die Diktier-Einstellungen im Überblick</w:t>
+      </w:r>
+    </w:p>
+    <w:p>
+      <w:pPr>
         <w:pStyle w:val="Heading2"/>
         <w:rPr/>
       </w:pPr>
@@ -3605,6 +3659,12 @@
           <w:b/>
         </w:rPr>
         <w:t>Whisper-Modell: „small“ ist schnell, „medium“ deutlich genauer (empfohlen). „large-v3“ nur mit einer starken Grafikkarte.</w:t>
+      </w:r>
+    </w:p>
+    <w:p>
+      <w:pPr/>
+      <w:r>
+        <w:t>GPU-Beschleunigung (NVIDIA): Hast du eine NVIDIA-Grafikkarte, installierst du im Bereich „Spracherkennung“ mit „GPU-Beschleunigung einrichten“ die CUDA-Komponenten – das macht die lokale Erkennung deutlich schneller. Danach WithEase einmal neu starten.</w:t>
       </w:r>
     </w:p>
     <w:p>

</xml_diff>

<commit_message>
release: v0.5.0 — cursor circle, local dictation in the .exe, media pause
Version bump to 0.5.0, CHANGELOG entry, and manual updates (DE + EN docx/PDF):
the permanent cursor circle, one-click local recognition in the packaged app,
and the pause-media-while-dictating option.

Co-Authored-By: Claude Opus 4.8 <noreply@anthropic.com>
</commit_message>
<xml_diff>
--- a/docs/WithEase-Anleitung.docx
+++ b/docs/WithEase-Anleitung.docx
@@ -115,7 +115,7 @@
           <w:color w:val="555555"/>
           <w:sz w:val="22"/>
         </w:rPr>
-        <w:t>Version 0.4.0</w:t>
+        <w:t>Version 0.5.0</w:t>
       </w:r>
     </w:p>
     <w:p>
@@ -1791,6 +1791,9 @@
         <w:rPr/>
         <w:t xml:space="preserve"> Pulsierende Ringe um den Zeiger, damit du ihn sofort siehst.</w:t>
       </w:r>
+      <w:r>
+        <w:t xml:space="preserve"> Optional zeigt WithEase zusätzlich einen dauerhaften, leicht transparenten Kreis, der dem Cursor ständig folgt (Größe und Deckkraft einstellbar).</w:t>
+      </w:r>
     </w:p>
     <w:p>
       <w:pPr>
@@ -3662,6 +3665,14 @@
       </w:r>
     </w:p>
     <w:p>
+      <w:pPr>
+        <w:pStyle w:val="ListBullet"/>
+      </w:pPr>
+      <w:r>
+        <w:t>Einrichten – auch in der App-Version (.exe): Wähle unter „Spracherkennung“ die lokale Erkennung und klicke auf „Automatisch installieren“. Beim ersten Mal lädt WithEase dafür eine kleine, eigene Spracherkennungs-Umgebung herunter (Internetverbindung nötig) – ein Klick genügt, keine Vorkenntnisse nötig, und alles bleibt auf diesem PC.</w:t>
+      </w:r>
+    </w:p>
+    <w:p>
       <w:pPr/>
       <w:r>
         <w:t>GPU-Beschleunigung (NVIDIA): Hast du eine NVIDIA-Grafikkarte, installierst du im Bereich „Spracherkennung“ mit „GPU-Beschleunigung einrichten“ die CUDA-Komponenten – das macht die lokale Erkennung deutlich schneller. Danach WithEase einmal neu starten.</w:t>
@@ -3677,6 +3688,14 @@
           <w:b w:val="false"/>
         </w:rPr>
         <w:t>Tipp: Ein gutes, nah am Mund platziertes Mikrofon (Headset) verbessert die Erkennung mit Abstand am meisten.</w:t>
+      </w:r>
+    </w:p>
+    <w:p>
+      <w:pPr>
+        <w:pStyle w:val="ListBullet"/>
+      </w:pPr>
+      <w:r>
+        <w:t>Medien pausieren: Unter „Spracherkennung“ – direkt unter dem Mikrofon – kannst du einstellen, dass Musik oder Video automatisch pausiert werden, sobald das Diktat startet. Die Wiedergabe läuft von selbst weiter, sobald das Diktat fertig ist (auch erst nach der Erkennung der Aufnahme).</w:t>
       </w:r>
     </w:p>
     <w:p>

</xml_diff>